<commit_message>
adding multiple values to searchbar
</commit_message>
<xml_diff>
--- a/Cambios de valores/Filtro superior horizontal.docx
+++ b/Cambios de valores/Filtro superior horizontal.docx
@@ -4,22 +4,549 @@
   <w:body>
     <w:p/>
     <w:p>
+      <w:pPr>
+        <w:rPr>
+          <w:lang w:val="en-US"/>
+        </w:rPr>
+      </w:pPr>
+      <w:r>
+        <w:rPr>
+          <w:lang w:val="en-US"/>
+        </w:rPr>
+        <w:t>Member-list</w:t>
+      </w:r>
+      <w:r>
+        <w:rPr>
+          <w:lang w:val="en-US"/>
+        </w:rPr>
+        <w:t>—</w:t>
+      </w:r>
+      <w:r>
+        <w:rPr>
+          <w:lang w:val="en-US"/>
+        </w:rPr>
+        <w:t>view</w:t>
+      </w:r>
+    </w:p>
+    <w:p>
+      <w:pPr>
+        <w:spacing w:before="100" w:beforeAutospacing="1" w:after="100" w:afterAutospacing="1" w:line="240" w:lineRule="auto"/>
+        <w:outlineLvl w:val="2"/>
+        <w:rPr>
+          <w:rFonts w:ascii="Times New Roman" w:eastAsia="Times New Roman" w:hAnsi="Times New Roman" w:cs="Times New Roman"/>
+          <w:b/>
+          <w:bCs/>
+          <w:sz w:val="27"/>
+          <w:szCs w:val="27"/>
+          <w:lang w:eastAsia="es-419"/>
+        </w:rPr>
+      </w:pPr>
       <w:proofErr w:type="spellStart"/>
       <w:r>
-        <w:t>Member-list</w:t>
-      </w:r>
-      <w:proofErr w:type="spellEnd"/>
-      <w:r>
-        <w:t>--</w:t>
-      </w:r>
-      <w:proofErr w:type="spellStart"/>
-      <w:r>
-        <w:t>view</w:t>
+        <w:rPr>
+          <w:rFonts w:ascii="Courier New" w:eastAsia="Times New Roman" w:hAnsi="Courier New" w:cs="Courier New"/>
+          <w:b/>
+          <w:bCs/>
+          <w:sz w:val="20"/>
+          <w:szCs w:val="20"/>
+          <w:lang w:eastAsia="es-419"/>
+        </w:rPr>
+        <w:t>MemberListView.jsx</w:t>
       </w:r>
       <w:proofErr w:type="spellEnd"/>
     </w:p>
     <w:p>
       <w:pPr>
+        <w:numPr>
+          <w:ilvl w:val="0"/>
+          <w:numId w:val="1"/>
+        </w:numPr>
+        <w:spacing w:before="100" w:beforeAutospacing="1" w:after="100" w:afterAutospacing="1" w:line="240" w:lineRule="auto"/>
+        <w:rPr>
+          <w:rFonts w:ascii="Times New Roman" w:eastAsia="Times New Roman" w:hAnsi="Times New Roman" w:cs="Times New Roman"/>
+          <w:sz w:val="24"/>
+          <w:szCs w:val="24"/>
+          <w:lang w:val="en-US" w:eastAsia="es-419"/>
+        </w:rPr>
+      </w:pPr>
+      <w:r>
+        <w:rPr>
+          <w:rFonts w:ascii="Courier New" w:eastAsia="Times New Roman" w:hAnsi="Courier New" w:cs="Courier New"/>
+          <w:sz w:val="20"/>
+          <w:szCs w:val="20"/>
+          <w:lang w:val="en-US" w:eastAsia="es-419"/>
+        </w:rPr>
+        <w:t>TABLE_HEAD</w:t>
+      </w:r>
+      <w:r>
+        <w:rPr>
+          <w:rFonts w:ascii="Times New Roman" w:eastAsia="Times New Roman" w:hAnsi="Times New Roman" w:cs="Times New Roman"/>
+          <w:sz w:val="24"/>
+          <w:szCs w:val="24"/>
+          <w:lang w:val="en-US" w:eastAsia="es-419"/>
+        </w:rPr>
+        <w:t xml:space="preserve">: </w:t>
+      </w:r>
+      <w:proofErr w:type="gramStart"/>
+      <w:r>
+        <w:rPr>
+          <w:rFonts w:ascii="Courier New" w:eastAsia="Times New Roman" w:hAnsi="Courier New" w:cs="Courier New"/>
+          <w:sz w:val="20"/>
+          <w:szCs w:val="20"/>
+          <w:lang w:val="en-US" w:eastAsia="es-419"/>
+        </w:rPr>
+        <w:t>{ id</w:t>
+      </w:r>
+      <w:proofErr w:type="gramEnd"/>
+      <w:r>
+        <w:rPr>
+          <w:rFonts w:ascii="Courier New" w:eastAsia="Times New Roman" w:hAnsi="Courier New" w:cs="Courier New"/>
+          <w:sz w:val="20"/>
+          <w:szCs w:val="20"/>
+          <w:lang w:val="en-US" w:eastAsia="es-419"/>
+        </w:rPr>
+        <w:t>: '</w:t>
+      </w:r>
+      <w:proofErr w:type="spellStart"/>
+      <w:r>
+        <w:rPr>
+          <w:rFonts w:ascii="Courier New" w:eastAsia="Times New Roman" w:hAnsi="Courier New" w:cs="Courier New"/>
+          <w:sz w:val="20"/>
+          <w:szCs w:val="20"/>
+          <w:lang w:val="en-US" w:eastAsia="es-419"/>
+        </w:rPr>
+        <w:t>memberDivision</w:t>
+      </w:r>
+      <w:proofErr w:type="spellEnd"/>
+      <w:r>
+        <w:rPr>
+          <w:rFonts w:ascii="Courier New" w:eastAsia="Times New Roman" w:hAnsi="Courier New" w:cs="Courier New"/>
+          <w:sz w:val="20"/>
+          <w:szCs w:val="20"/>
+          <w:lang w:val="en-US" w:eastAsia="es-419"/>
+        </w:rPr>
+        <w:t>', label: 'División', width: 170 }</w:t>
+      </w:r>
+    </w:p>
+    <w:p>
+      <w:pPr>
+        <w:numPr>
+          <w:ilvl w:val="0"/>
+          <w:numId w:val="1"/>
+        </w:numPr>
+        <w:spacing w:before="100" w:beforeAutospacing="1" w:after="100" w:afterAutospacing="1" w:line="240" w:lineRule="auto"/>
+        <w:rPr>
+          <w:rFonts w:ascii="Times New Roman" w:eastAsia="Times New Roman" w:hAnsi="Times New Roman" w:cs="Times New Roman"/>
+          <w:sz w:val="24"/>
+          <w:szCs w:val="24"/>
+          <w:lang w:eastAsia="es-419"/>
+        </w:rPr>
+      </w:pPr>
+      <w:proofErr w:type="spellStart"/>
+      <w:r>
+        <w:rPr>
+          <w:rFonts w:ascii="Times New Roman" w:eastAsia="Times New Roman" w:hAnsi="Times New Roman" w:cs="Times New Roman"/>
+          <w:sz w:val="24"/>
+          <w:szCs w:val="24"/>
+          <w:lang w:eastAsia="es-419"/>
+        </w:rPr>
+        <w:t>Tabs</w:t>
+      </w:r>
+      <w:proofErr w:type="spellEnd"/>
+      <w:r>
+        <w:rPr>
+          <w:rFonts w:ascii="Times New Roman" w:eastAsia="Times New Roman" w:hAnsi="Times New Roman" w:cs="Times New Roman"/>
+          <w:sz w:val="24"/>
+          <w:szCs w:val="24"/>
+          <w:lang w:eastAsia="es-419"/>
+        </w:rPr>
+        <w:t xml:space="preserve"> (conteo por división):</w:t>
+      </w:r>
+      <w:r>
+        <w:rPr>
+          <w:rFonts w:ascii="Times New Roman" w:eastAsia="Times New Roman" w:hAnsi="Times New Roman" w:cs="Times New Roman"/>
+          <w:sz w:val="24"/>
+          <w:szCs w:val="24"/>
+          <w:lang w:eastAsia="es-419"/>
+        </w:rPr>
+        <w:br/>
+      </w:r>
+      <w:proofErr w:type="spellStart"/>
+      <w:proofErr w:type="gramStart"/>
+      <w:r>
+        <w:rPr>
+          <w:rFonts w:ascii="Courier New" w:eastAsia="Times New Roman" w:hAnsi="Courier New" w:cs="Courier New"/>
+          <w:sz w:val="20"/>
+          <w:szCs w:val="20"/>
+          <w:lang w:eastAsia="es-419"/>
+        </w:rPr>
+        <w:t>member.memberDivision</w:t>
+      </w:r>
+      <w:proofErr w:type="spellEnd"/>
+      <w:proofErr w:type="gramEnd"/>
+      <w:r>
+        <w:rPr>
+          <w:rFonts w:ascii="Courier New" w:eastAsia="Times New Roman" w:hAnsi="Courier New" w:cs="Courier New"/>
+          <w:sz w:val="20"/>
+          <w:szCs w:val="20"/>
+          <w:lang w:eastAsia="es-419"/>
+        </w:rPr>
+        <w:t xml:space="preserve"> === </w:t>
+      </w:r>
+      <w:proofErr w:type="spellStart"/>
+      <w:r>
+        <w:rPr>
+          <w:rFonts w:ascii="Courier New" w:eastAsia="Times New Roman" w:hAnsi="Courier New" w:cs="Courier New"/>
+          <w:sz w:val="20"/>
+          <w:szCs w:val="20"/>
+          <w:lang w:eastAsia="es-419"/>
+        </w:rPr>
+        <w:t>tab.value</w:t>
+      </w:r>
+      <w:proofErr w:type="spellEnd"/>
+    </w:p>
+    <w:p>
+      <w:pPr>
+        <w:numPr>
+          <w:ilvl w:val="0"/>
+          <w:numId w:val="1"/>
+        </w:numPr>
+        <w:spacing w:before="100" w:beforeAutospacing="1" w:after="100" w:afterAutospacing="1" w:line="240" w:lineRule="auto"/>
+        <w:rPr>
+          <w:rFonts w:ascii="Times New Roman" w:eastAsia="Times New Roman" w:hAnsi="Times New Roman" w:cs="Times New Roman"/>
+          <w:sz w:val="24"/>
+          <w:szCs w:val="24"/>
+          <w:lang w:val="en-US" w:eastAsia="es-419"/>
+        </w:rPr>
+      </w:pPr>
+      <w:proofErr w:type="spellStart"/>
+      <w:r>
+        <w:rPr>
+          <w:rFonts w:ascii="Courier New" w:eastAsia="Times New Roman" w:hAnsi="Courier New" w:cs="Courier New"/>
+          <w:sz w:val="20"/>
+          <w:szCs w:val="20"/>
+          <w:lang w:val="en-US" w:eastAsia="es-419"/>
+        </w:rPr>
+        <w:t>applyFilter</w:t>
+      </w:r>
+      <w:proofErr w:type="spellEnd"/>
+      <w:r>
+        <w:rPr>
+          <w:rFonts w:ascii="Times New Roman" w:eastAsia="Times New Roman" w:hAnsi="Times New Roman" w:cs="Times New Roman"/>
+          <w:sz w:val="24"/>
+          <w:szCs w:val="24"/>
+          <w:lang w:val="en-US" w:eastAsia="es-419"/>
+        </w:rPr>
+        <w:t xml:space="preserve"> (</w:t>
+      </w:r>
+      <w:proofErr w:type="spellStart"/>
+      <w:r>
+        <w:rPr>
+          <w:rFonts w:ascii="Times New Roman" w:eastAsia="Times New Roman" w:hAnsi="Times New Roman" w:cs="Times New Roman"/>
+          <w:sz w:val="24"/>
+          <w:szCs w:val="24"/>
+          <w:lang w:val="en-US" w:eastAsia="es-419"/>
+        </w:rPr>
+        <w:t>filtro</w:t>
+      </w:r>
+      <w:proofErr w:type="spellEnd"/>
+      <w:r>
+        <w:rPr>
+          <w:rFonts w:ascii="Times New Roman" w:eastAsia="Times New Roman" w:hAnsi="Times New Roman" w:cs="Times New Roman"/>
+          <w:sz w:val="24"/>
+          <w:szCs w:val="24"/>
+          <w:lang w:val="en-US" w:eastAsia="es-419"/>
+        </w:rPr>
+        <w:t xml:space="preserve"> por </w:t>
+      </w:r>
+      <w:proofErr w:type="spellStart"/>
+      <w:r>
+        <w:rPr>
+          <w:rFonts w:ascii="Times New Roman" w:eastAsia="Times New Roman" w:hAnsi="Times New Roman" w:cs="Times New Roman"/>
+          <w:sz w:val="24"/>
+          <w:szCs w:val="24"/>
+          <w:lang w:val="en-US" w:eastAsia="es-419"/>
+        </w:rPr>
+        <w:t>división</w:t>
+      </w:r>
+      <w:proofErr w:type="spellEnd"/>
+      <w:r>
+        <w:rPr>
+          <w:rFonts w:ascii="Times New Roman" w:eastAsia="Times New Roman" w:hAnsi="Times New Roman" w:cs="Times New Roman"/>
+          <w:sz w:val="24"/>
+          <w:szCs w:val="24"/>
+          <w:lang w:val="en-US" w:eastAsia="es-419"/>
+        </w:rPr>
+        <w:t>):</w:t>
+      </w:r>
+      <w:r>
+        <w:rPr>
+          <w:rFonts w:ascii="Times New Roman" w:eastAsia="Times New Roman" w:hAnsi="Times New Roman" w:cs="Times New Roman"/>
+          <w:sz w:val="24"/>
+          <w:szCs w:val="24"/>
+          <w:lang w:val="en-US" w:eastAsia="es-419"/>
+        </w:rPr>
+        <w:br/>
+      </w:r>
+      <w:proofErr w:type="spellStart"/>
+      <w:proofErr w:type="gramStart"/>
+      <w:r>
+        <w:rPr>
+          <w:rFonts w:ascii="Courier New" w:eastAsia="Times New Roman" w:hAnsi="Courier New" w:cs="Courier New"/>
+          <w:sz w:val="20"/>
+          <w:szCs w:val="20"/>
+          <w:lang w:val="en-US" w:eastAsia="es-419"/>
+        </w:rPr>
+        <w:t>member.memberDivision</w:t>
+      </w:r>
+      <w:proofErr w:type="spellEnd"/>
+      <w:proofErr w:type="gramEnd"/>
+      <w:r>
+        <w:rPr>
+          <w:rFonts w:ascii="Courier New" w:eastAsia="Times New Roman" w:hAnsi="Courier New" w:cs="Courier New"/>
+          <w:sz w:val="20"/>
+          <w:szCs w:val="20"/>
+          <w:lang w:val="en-US" w:eastAsia="es-419"/>
+        </w:rPr>
+        <w:t xml:space="preserve"> === </w:t>
+      </w:r>
+      <w:proofErr w:type="spellStart"/>
+      <w:r>
+        <w:rPr>
+          <w:rFonts w:ascii="Courier New" w:eastAsia="Times New Roman" w:hAnsi="Courier New" w:cs="Courier New"/>
+          <w:sz w:val="20"/>
+          <w:szCs w:val="20"/>
+          <w:lang w:val="en-US" w:eastAsia="es-419"/>
+        </w:rPr>
+        <w:t>memberStatus</w:t>
+      </w:r>
+      <w:proofErr w:type="spellEnd"/>
+    </w:p>
+    <w:p>
+      <w:pPr>
+        <w:spacing w:after="0" w:line="240" w:lineRule="auto"/>
+        <w:rPr>
+          <w:rFonts w:ascii="Times New Roman" w:eastAsia="Times New Roman" w:hAnsi="Times New Roman" w:cs="Times New Roman"/>
+          <w:sz w:val="24"/>
+          <w:szCs w:val="24"/>
+          <w:lang w:eastAsia="es-419"/>
+        </w:rPr>
+      </w:pPr>
+      <w:r>
+        <w:rPr>
+          <w:rFonts w:ascii="Times New Roman" w:eastAsia="Times New Roman" w:hAnsi="Times New Roman" w:cs="Times New Roman"/>
+          <w:sz w:val="24"/>
+          <w:szCs w:val="24"/>
+          <w:lang w:eastAsia="es-419"/>
+        </w:rPr>
+        <w:pict w14:anchorId="7422BFC4">
+          <v:rect id="_x0000_i1025" style="width:0;height:1.5pt" o:hralign="center" o:hrstd="t" o:hr="t" fillcolor="#a0a0a0" stroked="f"/>
+        </w:pict>
+      </w:r>
+    </w:p>
+    <w:p>
+      <w:pPr>
+        <w:spacing w:before="100" w:beforeAutospacing="1" w:after="100" w:afterAutospacing="1" w:line="240" w:lineRule="auto"/>
+        <w:outlineLvl w:val="2"/>
+        <w:rPr>
+          <w:rFonts w:ascii="Times New Roman" w:eastAsia="Times New Roman" w:hAnsi="Times New Roman" w:cs="Times New Roman"/>
+          <w:b/>
+          <w:bCs/>
+          <w:sz w:val="27"/>
+          <w:szCs w:val="27"/>
+          <w:lang w:eastAsia="es-419"/>
+        </w:rPr>
+      </w:pPr>
+      <w:proofErr w:type="spellStart"/>
+      <w:r>
+        <w:rPr>
+          <w:rFonts w:ascii="Courier New" w:eastAsia="Times New Roman" w:hAnsi="Courier New" w:cs="Courier New"/>
+          <w:b/>
+          <w:bCs/>
+          <w:sz w:val="20"/>
+          <w:szCs w:val="20"/>
+          <w:lang w:eastAsia="es-419"/>
+        </w:rPr>
+        <w:t>MemberTableRow.jsx</w:t>
+      </w:r>
+      <w:proofErr w:type="spellEnd"/>
+    </w:p>
+    <w:p>
+      <w:pPr>
+        <w:numPr>
+          <w:ilvl w:val="0"/>
+          <w:numId w:val="2"/>
+        </w:numPr>
+        <w:spacing w:before="100" w:beforeAutospacing="1" w:after="100" w:afterAutospacing="1" w:line="240" w:lineRule="auto"/>
+        <w:rPr>
+          <w:rFonts w:ascii="Times New Roman" w:eastAsia="Times New Roman" w:hAnsi="Times New Roman" w:cs="Times New Roman"/>
+          <w:sz w:val="24"/>
+          <w:szCs w:val="24"/>
+          <w:lang w:eastAsia="es-419"/>
+        </w:rPr>
+      </w:pPr>
+      <w:r>
+        <w:rPr>
+          <w:rFonts w:ascii="Times New Roman" w:eastAsia="Times New Roman" w:hAnsi="Times New Roman" w:cs="Times New Roman"/>
+          <w:sz w:val="24"/>
+          <w:szCs w:val="24"/>
+          <w:lang w:eastAsia="es-419"/>
+        </w:rPr>
+        <w:t>Render de celda (columna División):</w:t>
+      </w:r>
+      <w:r>
+        <w:rPr>
+          <w:rFonts w:ascii="Times New Roman" w:eastAsia="Times New Roman" w:hAnsi="Times New Roman" w:cs="Times New Roman"/>
+          <w:sz w:val="24"/>
+          <w:szCs w:val="24"/>
+          <w:lang w:eastAsia="es-419"/>
+        </w:rPr>
+        <w:br/>
+      </w:r>
+      <w:r>
+        <w:rPr>
+          <w:rFonts w:ascii="Courier New" w:eastAsia="Times New Roman" w:hAnsi="Courier New" w:cs="Courier New"/>
+          <w:sz w:val="20"/>
+          <w:szCs w:val="20"/>
+          <w:lang w:eastAsia="es-419"/>
+        </w:rPr>
+        <w:t>{</w:t>
+      </w:r>
+      <w:proofErr w:type="spellStart"/>
+      <w:proofErr w:type="gramStart"/>
+      <w:r>
+        <w:rPr>
+          <w:rFonts w:ascii="Courier New" w:eastAsia="Times New Roman" w:hAnsi="Courier New" w:cs="Courier New"/>
+          <w:sz w:val="20"/>
+          <w:szCs w:val="20"/>
+          <w:lang w:eastAsia="es-419"/>
+        </w:rPr>
+        <w:t>row.memberDivision</w:t>
+      </w:r>
+      <w:proofErr w:type="spellEnd"/>
+      <w:proofErr w:type="gramEnd"/>
+      <w:r>
+        <w:rPr>
+          <w:rFonts w:ascii="Courier New" w:eastAsia="Times New Roman" w:hAnsi="Courier New" w:cs="Courier New"/>
+          <w:sz w:val="20"/>
+          <w:szCs w:val="20"/>
+          <w:lang w:eastAsia="es-419"/>
+        </w:rPr>
+        <w:t>}</w:t>
+      </w:r>
+    </w:p>
+    <w:p>
+      <w:pPr>
+        <w:spacing w:after="0" w:line="240" w:lineRule="auto"/>
+        <w:rPr>
+          <w:rFonts w:ascii="Times New Roman" w:eastAsia="Times New Roman" w:hAnsi="Times New Roman" w:cs="Times New Roman"/>
+          <w:sz w:val="24"/>
+          <w:szCs w:val="24"/>
+          <w:lang w:eastAsia="es-419"/>
+        </w:rPr>
+      </w:pPr>
+      <w:r>
+        <w:rPr>
+          <w:rFonts w:ascii="Times New Roman" w:eastAsia="Times New Roman" w:hAnsi="Times New Roman" w:cs="Times New Roman"/>
+          <w:sz w:val="24"/>
+          <w:szCs w:val="24"/>
+          <w:lang w:eastAsia="es-419"/>
+        </w:rPr>
+        <w:pict w14:anchorId="7423C3FA">
+          <v:rect id="_x0000_i1026" style="width:0;height:1.5pt" o:hralign="center" o:hrstd="t" o:hr="t" fillcolor="#a0a0a0" stroked="f"/>
+        </w:pict>
+      </w:r>
+    </w:p>
+    <w:p>
+      <w:pPr>
+        <w:spacing w:before="100" w:beforeAutospacing="1" w:after="100" w:afterAutospacing="1" w:line="240" w:lineRule="auto"/>
+        <w:outlineLvl w:val="2"/>
+        <w:rPr>
+          <w:rFonts w:ascii="Times New Roman" w:eastAsia="Times New Roman" w:hAnsi="Times New Roman" w:cs="Times New Roman"/>
+          <w:b/>
+          <w:bCs/>
+          <w:sz w:val="27"/>
+          <w:szCs w:val="27"/>
+          <w:lang w:eastAsia="es-419"/>
+        </w:rPr>
+      </w:pPr>
+      <w:proofErr w:type="spellStart"/>
+      <w:r>
+        <w:rPr>
+          <w:rFonts w:ascii="Courier New" w:eastAsia="Times New Roman" w:hAnsi="Courier New" w:cs="Courier New"/>
+          <w:b/>
+          <w:bCs/>
+          <w:sz w:val="20"/>
+          <w:szCs w:val="20"/>
+          <w:lang w:eastAsia="es-419"/>
+        </w:rPr>
+        <w:t>MemberTableFiltersResult.jsx</w:t>
+      </w:r>
+      <w:proofErr w:type="spellEnd"/>
+    </w:p>
+    <w:p>
+      <w:pPr>
+        <w:numPr>
+          <w:ilvl w:val="0"/>
+          <w:numId w:val="3"/>
+        </w:numPr>
+        <w:spacing w:before="100" w:beforeAutospacing="1" w:after="100" w:afterAutospacing="1" w:line="240" w:lineRule="auto"/>
+        <w:rPr>
+          <w:rFonts w:ascii="Times New Roman" w:eastAsia="Times New Roman" w:hAnsi="Times New Roman" w:cs="Times New Roman"/>
+          <w:sz w:val="24"/>
+          <w:szCs w:val="24"/>
+          <w:lang w:eastAsia="es-419"/>
+        </w:rPr>
+      </w:pPr>
+      <w:r>
+        <w:rPr>
+          <w:rFonts w:ascii="Times New Roman" w:eastAsia="Times New Roman" w:hAnsi="Times New Roman" w:cs="Times New Roman"/>
+          <w:b/>
+          <w:bCs/>
+          <w:sz w:val="24"/>
+          <w:szCs w:val="24"/>
+          <w:lang w:eastAsia="es-419"/>
+        </w:rPr>
+        <w:t>No aparece</w:t>
+      </w:r>
+      <w:r>
+        <w:rPr>
+          <w:rFonts w:ascii="Times New Roman" w:eastAsia="Times New Roman" w:hAnsi="Times New Roman" w:cs="Times New Roman"/>
+          <w:sz w:val="24"/>
+          <w:szCs w:val="24"/>
+          <w:lang w:eastAsia="es-419"/>
+        </w:rPr>
+        <w:t xml:space="preserve"> (usa </w:t>
+      </w:r>
+      <w:proofErr w:type="spellStart"/>
+      <w:r>
+        <w:rPr>
+          <w:rFonts w:ascii="Courier New" w:eastAsia="Times New Roman" w:hAnsi="Courier New" w:cs="Courier New"/>
+          <w:sz w:val="20"/>
+          <w:szCs w:val="20"/>
+          <w:lang w:eastAsia="es-419"/>
+        </w:rPr>
+        <w:t>memberStatus</w:t>
+      </w:r>
+      <w:proofErr w:type="spellEnd"/>
+      <w:r>
+        <w:rPr>
+          <w:rFonts w:ascii="Times New Roman" w:eastAsia="Times New Roman" w:hAnsi="Times New Roman" w:cs="Times New Roman"/>
+          <w:sz w:val="24"/>
+          <w:szCs w:val="24"/>
+          <w:lang w:eastAsia="es-419"/>
+        </w:rPr>
+        <w:t xml:space="preserve"> para el filtro de División)</w:t>
+      </w:r>
+    </w:p>
+    <w:p>
+      <w:r>
+        <w:br w:type="page"/>
+      </w:r>
+    </w:p>
+    <w:p/>
+    <w:p>
+      <w:pPr>
         <w:shd w:val="clear" w:color="auto" w:fill="24283B"/>
         <w:spacing w:after="0" w:line="285" w:lineRule="atLeast"/>
         <w:rPr>
@@ -143,6 +670,7 @@
         <w:t xml:space="preserve"> </w:t>
       </w:r>
       <w:proofErr w:type="spellStart"/>
+      <w:proofErr w:type="gramStart"/>
       <w:r>
         <w:rPr>
           <w:rFonts w:ascii="Consolas" w:eastAsia="Times New Roman" w:hAnsi="Consolas" w:cs="Times New Roman"/>
@@ -174,6 +702,7 @@
         <w:t>memberDivision</w:t>
       </w:r>
       <w:proofErr w:type="spellEnd"/>
+      <w:proofErr w:type="gramEnd"/>
       <w:r>
         <w:rPr>
           <w:rFonts w:ascii="Consolas" w:eastAsia="Times New Roman" w:hAnsi="Consolas" w:cs="Times New Roman"/>
@@ -317,6 +846,7 @@
         <w:t xml:space="preserve"> (</w:t>
       </w:r>
       <w:proofErr w:type="spellStart"/>
+      <w:proofErr w:type="gramStart"/>
       <w:r>
         <w:rPr>
           <w:rFonts w:ascii="Consolas" w:eastAsia="Times New Roman" w:hAnsi="Consolas" w:cs="Times New Roman"/>
@@ -346,7 +876,18 @@
           <w:szCs w:val="21"/>
           <w:lang w:val="en-US" w:eastAsia="es-419"/>
         </w:rPr>
-        <w:t>!==</w:t>
+        <w:t>!</w:t>
+      </w:r>
+      <w:proofErr w:type="gramEnd"/>
+      <w:r>
+        <w:rPr>
+          <w:rFonts w:ascii="Consolas" w:eastAsia="Times New Roman" w:hAnsi="Consolas" w:cs="Times New Roman"/>
+          <w:color w:val="BB9AF7"/>
+          <w:sz w:val="21"/>
+          <w:szCs w:val="21"/>
+          <w:lang w:val="en-US" w:eastAsia="es-419"/>
+        </w:rPr>
+        <w:t>==</w:t>
       </w:r>
       <w:r>
         <w:rPr>
@@ -546,6 +1087,7 @@
         <w:t xml:space="preserve"> </w:t>
       </w:r>
       <w:proofErr w:type="spellStart"/>
+      <w:proofErr w:type="gramStart"/>
       <w:r>
         <w:rPr>
           <w:rFonts w:ascii="Consolas" w:eastAsia="Times New Roman" w:hAnsi="Consolas" w:cs="Times New Roman"/>
@@ -577,6 +1119,7 @@
         <w:t>memberDivision</w:t>
       </w:r>
       <w:proofErr w:type="spellEnd"/>
+      <w:proofErr w:type="gramEnd"/>
       <w:r>
         <w:rPr>
           <w:rFonts w:ascii="Consolas" w:eastAsia="Times New Roman" w:hAnsi="Consolas" w:cs="Times New Roman"/>
@@ -649,7 +1192,7 @@
           <w:color w:val="A9B1D6"/>
           <w:sz w:val="21"/>
           <w:szCs w:val="21"/>
-          <w:lang w:eastAsia="es-419"/>
+          <w:lang w:val="en-US" w:eastAsia="es-419"/>
         </w:rPr>
       </w:pPr>
       <w:r>
@@ -668,7 +1211,7 @@
           <w:color w:val="9ABDF5"/>
           <w:sz w:val="21"/>
           <w:szCs w:val="21"/>
-          <w:lang w:eastAsia="es-419"/>
+          <w:lang w:val="en-US" w:eastAsia="es-419"/>
         </w:rPr>
         <w:t>}</w:t>
       </w:r>
@@ -745,6 +1288,7 @@
         </w:rPr>
         <w:t>variant</w:t>
       </w:r>
+      <w:proofErr w:type="gramStart"/>
       <w:r>
         <w:rPr>
           <w:rFonts w:ascii="Consolas" w:eastAsia="Times New Roman" w:hAnsi="Consolas" w:cs="Times New Roman"/>
@@ -765,6 +1309,7 @@
         </w:rPr>
         <w:t>{</w:t>
       </w:r>
+      <w:proofErr w:type="gramEnd"/>
     </w:p>
     <w:p>
       <w:pPr>
@@ -1233,6 +1778,7 @@
         </w:rPr>
         <w:t>color</w:t>
       </w:r>
+      <w:proofErr w:type="gramStart"/>
       <w:r>
         <w:rPr>
           <w:rFonts w:ascii="Consolas" w:eastAsia="Times New Roman" w:hAnsi="Consolas" w:cs="Times New Roman"/>
@@ -1253,6 +1799,7 @@
         </w:rPr>
         <w:t>{</w:t>
       </w:r>
+      <w:proofErr w:type="gramEnd"/>
     </w:p>
     <w:p>
       <w:pPr>
@@ -1287,6 +1834,7 @@
         <w:t>(</w:t>
       </w:r>
       <w:proofErr w:type="spellStart"/>
+      <w:proofErr w:type="gramStart"/>
       <w:r>
         <w:rPr>
           <w:rFonts w:ascii="Consolas" w:eastAsia="Times New Roman" w:hAnsi="Consolas" w:cs="Times New Roman"/>
@@ -1297,6 +1845,7 @@
         </w:rPr>
         <w:t>tab</w:t>
       </w:r>
+      <w:proofErr w:type="gramEnd"/>
       <w:r>
         <w:rPr>
           <w:rFonts w:ascii="Consolas" w:eastAsia="Times New Roman" w:hAnsi="Consolas" w:cs="Times New Roman"/>
@@ -1504,6 +2053,7 @@
         <w:t>(</w:t>
       </w:r>
       <w:proofErr w:type="spellStart"/>
+      <w:proofErr w:type="gramStart"/>
       <w:r>
         <w:rPr>
           <w:rFonts w:ascii="Consolas" w:eastAsia="Times New Roman" w:hAnsi="Consolas" w:cs="Times New Roman"/>
@@ -1514,6 +2064,7 @@
         </w:rPr>
         <w:t>tab</w:t>
       </w:r>
+      <w:proofErr w:type="gramEnd"/>
       <w:r>
         <w:rPr>
           <w:rFonts w:ascii="Consolas" w:eastAsia="Times New Roman" w:hAnsi="Consolas" w:cs="Times New Roman"/>
@@ -1721,6 +2272,7 @@
         <w:t>(</w:t>
       </w:r>
       <w:proofErr w:type="spellStart"/>
+      <w:proofErr w:type="gramStart"/>
       <w:r>
         <w:rPr>
           <w:rFonts w:ascii="Consolas" w:eastAsia="Times New Roman" w:hAnsi="Consolas" w:cs="Times New Roman"/>
@@ -1731,6 +2283,7 @@
         </w:rPr>
         <w:t>tab</w:t>
       </w:r>
+      <w:proofErr w:type="gramEnd"/>
       <w:r>
         <w:rPr>
           <w:rFonts w:ascii="Consolas" w:eastAsia="Times New Roman" w:hAnsi="Consolas" w:cs="Times New Roman"/>
@@ -1938,6 +2491,7 @@
         <w:t>(</w:t>
       </w:r>
       <w:proofErr w:type="spellStart"/>
+      <w:proofErr w:type="gramStart"/>
       <w:r>
         <w:rPr>
           <w:rFonts w:ascii="Consolas" w:eastAsia="Times New Roman" w:hAnsi="Consolas" w:cs="Times New Roman"/>
@@ -1948,6 +2502,7 @@
         </w:rPr>
         <w:t>tab</w:t>
       </w:r>
+      <w:proofErr w:type="gramEnd"/>
       <w:r>
         <w:rPr>
           <w:rFonts w:ascii="Consolas" w:eastAsia="Times New Roman" w:hAnsi="Consolas" w:cs="Times New Roman"/>
@@ -2441,6 +2996,7 @@
         </w:rPr>
         <w:t>'</w:t>
       </w:r>
+      <w:proofErr w:type="gramStart"/>
       <w:r>
         <w:rPr>
           <w:rFonts w:ascii="Consolas" w:eastAsia="Times New Roman" w:hAnsi="Consolas" w:cs="Times New Roman"/>
@@ -2471,6 +3027,7 @@
         </w:rPr>
         <w:t>includes</w:t>
       </w:r>
+      <w:proofErr w:type="gramEnd"/>
       <w:r>
         <w:rPr>
           <w:rFonts w:ascii="Consolas" w:eastAsia="Times New Roman" w:hAnsi="Consolas" w:cs="Times New Roman"/>
@@ -2659,6 +3216,7 @@
         <w:t xml:space="preserve"> </w:t>
       </w:r>
       <w:proofErr w:type="spellStart"/>
+      <w:proofErr w:type="gramStart"/>
       <w:r>
         <w:rPr>
           <w:rFonts w:ascii="Consolas" w:eastAsia="Times New Roman" w:hAnsi="Consolas" w:cs="Times New Roman"/>
@@ -2690,6 +3248,7 @@
         <w:t>memberDivision</w:t>
       </w:r>
       <w:proofErr w:type="spellEnd"/>
+      <w:proofErr w:type="gramEnd"/>
       <w:r>
         <w:rPr>
           <w:rFonts w:ascii="Consolas" w:eastAsia="Times New Roman" w:hAnsi="Consolas" w:cs="Times New Roman"/>
@@ -3020,7 +3579,7 @@
           <w:color w:val="A9B1D6"/>
           <w:sz w:val="21"/>
           <w:szCs w:val="21"/>
-          <w:lang w:val="en-US" w:eastAsia="es-419"/>
+          <w:lang w:eastAsia="es-419"/>
         </w:rPr>
       </w:pPr>
       <w:r>
@@ -3031,11 +3590,11 @@
           <w:color w:val="5F6996"/>
           <w:sz w:val="21"/>
           <w:szCs w:val="21"/>
-          <w:lang w:val="en-US" w:eastAsia="es-419"/>
-        </w:rPr>
-        <w:t>//   { value: 'all', label: '</w:t>
-      </w:r>
-      <w:proofErr w:type="spellStart"/>
+          <w:lang w:eastAsia="es-419"/>
+        </w:rPr>
+        <w:t>//</w:t>
+      </w:r>
+      <w:proofErr w:type="gramStart"/>
       <w:r>
         <w:rPr>
           <w:rFonts w:ascii="Consolas" w:eastAsia="Times New Roman" w:hAnsi="Consolas" w:cs="Times New Roman"/>
@@ -3044,11 +3603,11 @@
           <w:color w:val="5F6996"/>
           <w:sz w:val="21"/>
           <w:szCs w:val="21"/>
-          <w:lang w:val="en-US" w:eastAsia="es-419"/>
-        </w:rPr>
-        <w:t>Todos</w:t>
-      </w:r>
-      <w:proofErr w:type="spellEnd"/>
+          <w:lang w:eastAsia="es-419"/>
+        </w:rPr>
+        <w:t xml:space="preserve">   {</w:t>
+      </w:r>
+      <w:proofErr w:type="gramEnd"/>
       <w:r>
         <w:rPr>
           <w:rFonts w:ascii="Consolas" w:eastAsia="Times New Roman" w:hAnsi="Consolas" w:cs="Times New Roman"/>
@@ -3057,23 +3616,11 @@
           <w:color w:val="5F6996"/>
           <w:sz w:val="21"/>
           <w:szCs w:val="21"/>
-          <w:lang w:val="en-US" w:eastAsia="es-419"/>
-        </w:rPr>
-        <w:t>' },</w:t>
-      </w:r>
-    </w:p>
-    <w:p>
-      <w:pPr>
-        <w:shd w:val="clear" w:color="auto" w:fill="24283B"/>
-        <w:spacing w:after="0" w:line="285" w:lineRule="atLeast"/>
-        <w:rPr>
-          <w:rFonts w:ascii="Consolas" w:eastAsia="Times New Roman" w:hAnsi="Consolas" w:cs="Times New Roman"/>
-          <w:color w:val="A9B1D6"/>
-          <w:sz w:val="21"/>
-          <w:szCs w:val="21"/>
-          <w:lang w:eastAsia="es-419"/>
-        </w:rPr>
-      </w:pPr>
+          <w:lang w:eastAsia="es-419"/>
+        </w:rPr>
+        <w:t xml:space="preserve"> </w:t>
+      </w:r>
+      <w:proofErr w:type="spellStart"/>
       <w:r>
         <w:rPr>
           <w:rFonts w:ascii="Consolas" w:eastAsia="Times New Roman" w:hAnsi="Consolas" w:cs="Times New Roman"/>
@@ -3084,9 +3631,9 @@
           <w:szCs w:val="21"/>
           <w:lang w:eastAsia="es-419"/>
         </w:rPr>
-        <w:t xml:space="preserve">//   { </w:t>
-      </w:r>
-      <w:proofErr w:type="spellStart"/>
+        <w:t>value</w:t>
+      </w:r>
+      <w:proofErr w:type="spellEnd"/>
       <w:r>
         <w:rPr>
           <w:rFonts w:ascii="Consolas" w:eastAsia="Times New Roman" w:hAnsi="Consolas" w:cs="Times New Roman"/>
@@ -3097,9 +3644,9 @@
           <w:szCs w:val="21"/>
           <w:lang w:eastAsia="es-419"/>
         </w:rPr>
-        <w:t>value</w:t>
-      </w:r>
-      <w:proofErr w:type="spellEnd"/>
+        <w:t>: '</w:t>
+      </w:r>
+      <w:proofErr w:type="spellStart"/>
       <w:r>
         <w:rPr>
           <w:rFonts w:ascii="Consolas" w:eastAsia="Times New Roman" w:hAnsi="Consolas" w:cs="Times New Roman"/>
@@ -3110,9 +3657,9 @@
           <w:szCs w:val="21"/>
           <w:lang w:eastAsia="es-419"/>
         </w:rPr>
-        <w:t xml:space="preserve">: 'Exploradores', </w:t>
-      </w:r>
-      <w:proofErr w:type="spellStart"/>
+        <w:t>all</w:t>
+      </w:r>
+      <w:proofErr w:type="spellEnd"/>
       <w:r>
         <w:rPr>
           <w:rFonts w:ascii="Consolas" w:eastAsia="Times New Roman" w:hAnsi="Consolas" w:cs="Times New Roman"/>
@@ -3123,9 +3670,9 @@
           <w:szCs w:val="21"/>
           <w:lang w:eastAsia="es-419"/>
         </w:rPr>
-        <w:t>label</w:t>
-      </w:r>
-      <w:proofErr w:type="spellEnd"/>
+        <w:t xml:space="preserve">', </w:t>
+      </w:r>
+      <w:proofErr w:type="spellStart"/>
       <w:r>
         <w:rPr>
           <w:rFonts w:ascii="Consolas" w:eastAsia="Times New Roman" w:hAnsi="Consolas" w:cs="Times New Roman"/>
@@ -3136,21 +3683,9 @@
           <w:szCs w:val="21"/>
           <w:lang w:eastAsia="es-419"/>
         </w:rPr>
-        <w:t>: 'Exploradores' },</w:t>
-      </w:r>
-    </w:p>
-    <w:p>
-      <w:pPr>
-        <w:shd w:val="clear" w:color="auto" w:fill="24283B"/>
-        <w:spacing w:after="0" w:line="285" w:lineRule="atLeast"/>
-        <w:rPr>
-          <w:rFonts w:ascii="Consolas" w:eastAsia="Times New Roman" w:hAnsi="Consolas" w:cs="Times New Roman"/>
-          <w:color w:val="A9B1D6"/>
-          <w:sz w:val="21"/>
-          <w:szCs w:val="21"/>
-          <w:lang w:eastAsia="es-419"/>
-        </w:rPr>
-      </w:pPr>
+        <w:t>label</w:t>
+      </w:r>
+      <w:proofErr w:type="spellEnd"/>
       <w:r>
         <w:rPr>
           <w:rFonts w:ascii="Consolas" w:eastAsia="Times New Roman" w:hAnsi="Consolas" w:cs="Times New Roman"/>
@@ -3161,9 +3696,21 @@
           <w:szCs w:val="21"/>
           <w:lang w:eastAsia="es-419"/>
         </w:rPr>
-        <w:t xml:space="preserve">//   { </w:t>
-      </w:r>
-      <w:proofErr w:type="spellStart"/>
+        <w:t>: 'Todos' },</w:t>
+      </w:r>
+    </w:p>
+    <w:p>
+      <w:pPr>
+        <w:shd w:val="clear" w:color="auto" w:fill="24283B"/>
+        <w:spacing w:after="0" w:line="285" w:lineRule="atLeast"/>
+        <w:rPr>
+          <w:rFonts w:ascii="Consolas" w:eastAsia="Times New Roman" w:hAnsi="Consolas" w:cs="Times New Roman"/>
+          <w:color w:val="A9B1D6"/>
+          <w:sz w:val="21"/>
+          <w:szCs w:val="21"/>
+          <w:lang w:eastAsia="es-419"/>
+        </w:rPr>
+      </w:pPr>
       <w:r>
         <w:rPr>
           <w:rFonts w:ascii="Consolas" w:eastAsia="Times New Roman" w:hAnsi="Consolas" w:cs="Times New Roman"/>
@@ -3174,9 +3721,9 @@
           <w:szCs w:val="21"/>
           <w:lang w:eastAsia="es-419"/>
         </w:rPr>
-        <w:t>value</w:t>
-      </w:r>
-      <w:proofErr w:type="spellEnd"/>
+        <w:t>//</w:t>
+      </w:r>
+      <w:proofErr w:type="gramStart"/>
       <w:r>
         <w:rPr>
           <w:rFonts w:ascii="Consolas" w:eastAsia="Times New Roman" w:hAnsi="Consolas" w:cs="Times New Roman"/>
@@ -3187,9 +3734,9 @@
           <w:szCs w:val="21"/>
           <w:lang w:eastAsia="es-419"/>
         </w:rPr>
-        <w:t xml:space="preserve">: 'Seguidores', </w:t>
-      </w:r>
-      <w:proofErr w:type="spellStart"/>
+        <w:t xml:space="preserve">   {</w:t>
+      </w:r>
+      <w:proofErr w:type="gramEnd"/>
       <w:r>
         <w:rPr>
           <w:rFonts w:ascii="Consolas" w:eastAsia="Times New Roman" w:hAnsi="Consolas" w:cs="Times New Roman"/>
@@ -3200,9 +3747,9 @@
           <w:szCs w:val="21"/>
           <w:lang w:eastAsia="es-419"/>
         </w:rPr>
-        <w:t>label</w:t>
-      </w:r>
-      <w:proofErr w:type="spellEnd"/>
+        <w:t xml:space="preserve"> </w:t>
+      </w:r>
+      <w:proofErr w:type="spellStart"/>
       <w:r>
         <w:rPr>
           <w:rFonts w:ascii="Consolas" w:eastAsia="Times New Roman" w:hAnsi="Consolas" w:cs="Times New Roman"/>
@@ -3213,21 +3760,9 @@
           <w:szCs w:val="21"/>
           <w:lang w:eastAsia="es-419"/>
         </w:rPr>
-        <w:t>: 'Seguidores' },</w:t>
-      </w:r>
-    </w:p>
-    <w:p>
-      <w:pPr>
-        <w:shd w:val="clear" w:color="auto" w:fill="24283B"/>
-        <w:spacing w:after="0" w:line="285" w:lineRule="atLeast"/>
-        <w:rPr>
-          <w:rFonts w:ascii="Consolas" w:eastAsia="Times New Roman" w:hAnsi="Consolas" w:cs="Times New Roman"/>
-          <w:color w:val="A9B1D6"/>
-          <w:sz w:val="21"/>
-          <w:szCs w:val="21"/>
-          <w:lang w:eastAsia="es-419"/>
-        </w:rPr>
-      </w:pPr>
+        <w:t>value</w:t>
+      </w:r>
+      <w:proofErr w:type="spellEnd"/>
       <w:r>
         <w:rPr>
           <w:rFonts w:ascii="Consolas" w:eastAsia="Times New Roman" w:hAnsi="Consolas" w:cs="Times New Roman"/>
@@ -3238,7 +3773,7 @@
           <w:szCs w:val="21"/>
           <w:lang w:eastAsia="es-419"/>
         </w:rPr>
-        <w:t xml:space="preserve">//   { </w:t>
+        <w:t xml:space="preserve">: 'Exploradores', </w:t>
       </w:r>
       <w:proofErr w:type="spellStart"/>
       <w:r>
@@ -3251,7 +3786,7 @@
           <w:szCs w:val="21"/>
           <w:lang w:eastAsia="es-419"/>
         </w:rPr>
-        <w:t>value</w:t>
+        <w:t>label</w:t>
       </w:r>
       <w:proofErr w:type="spellEnd"/>
       <w:r>
@@ -3264,9 +3799,21 @@
           <w:szCs w:val="21"/>
           <w:lang w:eastAsia="es-419"/>
         </w:rPr>
-        <w:t xml:space="preserve">: 'Pioneros', </w:t>
-      </w:r>
-      <w:proofErr w:type="spellStart"/>
+        <w:t>: 'Exploradores' },</w:t>
+      </w:r>
+    </w:p>
+    <w:p>
+      <w:pPr>
+        <w:shd w:val="clear" w:color="auto" w:fill="24283B"/>
+        <w:spacing w:after="0" w:line="285" w:lineRule="atLeast"/>
+        <w:rPr>
+          <w:rFonts w:ascii="Consolas" w:eastAsia="Times New Roman" w:hAnsi="Consolas" w:cs="Times New Roman"/>
+          <w:color w:val="A9B1D6"/>
+          <w:sz w:val="21"/>
+          <w:szCs w:val="21"/>
+          <w:lang w:eastAsia="es-419"/>
+        </w:rPr>
+      </w:pPr>
       <w:r>
         <w:rPr>
           <w:rFonts w:ascii="Consolas" w:eastAsia="Times New Roman" w:hAnsi="Consolas" w:cs="Times New Roman"/>
@@ -3277,9 +3824,9 @@
           <w:szCs w:val="21"/>
           <w:lang w:eastAsia="es-419"/>
         </w:rPr>
-        <w:t>label</w:t>
-      </w:r>
-      <w:proofErr w:type="spellEnd"/>
+        <w:t>//</w:t>
+      </w:r>
+      <w:proofErr w:type="gramStart"/>
       <w:r>
         <w:rPr>
           <w:rFonts w:ascii="Consolas" w:eastAsia="Times New Roman" w:hAnsi="Consolas" w:cs="Times New Roman"/>
@@ -3290,21 +3837,9 @@
           <w:szCs w:val="21"/>
           <w:lang w:eastAsia="es-419"/>
         </w:rPr>
-        <w:t>: 'Pioneros' },</w:t>
-      </w:r>
-    </w:p>
-    <w:p>
-      <w:pPr>
-        <w:shd w:val="clear" w:color="auto" w:fill="24283B"/>
-        <w:spacing w:after="0" w:line="285" w:lineRule="atLeast"/>
-        <w:rPr>
-          <w:rFonts w:ascii="Consolas" w:eastAsia="Times New Roman" w:hAnsi="Consolas" w:cs="Times New Roman"/>
-          <w:color w:val="A9B1D6"/>
-          <w:sz w:val="21"/>
-          <w:szCs w:val="21"/>
-          <w:lang w:eastAsia="es-419"/>
-        </w:rPr>
-      </w:pPr>
+        <w:t xml:space="preserve">   {</w:t>
+      </w:r>
+      <w:proofErr w:type="gramEnd"/>
       <w:r>
         <w:rPr>
           <w:rFonts w:ascii="Consolas" w:eastAsia="Times New Roman" w:hAnsi="Consolas" w:cs="Times New Roman"/>
@@ -3315,7 +3850,7 @@
           <w:szCs w:val="21"/>
           <w:lang w:eastAsia="es-419"/>
         </w:rPr>
-        <w:t xml:space="preserve">//   { </w:t>
+        <w:t xml:space="preserve"> </w:t>
       </w:r>
       <w:proofErr w:type="spellStart"/>
       <w:r>
@@ -3341,7 +3876,7 @@
           <w:szCs w:val="21"/>
           <w:lang w:eastAsia="es-419"/>
         </w:rPr>
-        <w:t xml:space="preserve">: 'Navegantes', </w:t>
+        <w:t xml:space="preserve">: 'Seguidores', </w:t>
       </w:r>
       <w:proofErr w:type="spellStart"/>
       <w:r>
@@ -3367,7 +3902,7 @@
           <w:szCs w:val="21"/>
           <w:lang w:eastAsia="es-419"/>
         </w:rPr>
-        <w:t>: 'Navegantes' },</w:t>
+        <w:t>: 'Seguidores' },</w:t>
       </w:r>
     </w:p>
     <w:p>
@@ -3379,7 +3914,7 @@
           <w:color w:val="A9B1D6"/>
           <w:sz w:val="21"/>
           <w:szCs w:val="21"/>
-          <w:lang w:val="en-US" w:eastAsia="es-419"/>
+          <w:lang w:eastAsia="es-419"/>
         </w:rPr>
       </w:pPr>
       <w:r>
@@ -3390,6 +3925,212 @@
           <w:color w:val="5F6996"/>
           <w:sz w:val="21"/>
           <w:szCs w:val="21"/>
+          <w:lang w:eastAsia="es-419"/>
+        </w:rPr>
+        <w:t>//</w:t>
+      </w:r>
+      <w:proofErr w:type="gramStart"/>
+      <w:r>
+        <w:rPr>
+          <w:rFonts w:ascii="Consolas" w:eastAsia="Times New Roman" w:hAnsi="Consolas" w:cs="Times New Roman"/>
+          <w:i/>
+          <w:iCs/>
+          <w:color w:val="5F6996"/>
+          <w:sz w:val="21"/>
+          <w:szCs w:val="21"/>
+          <w:lang w:eastAsia="es-419"/>
+        </w:rPr>
+        <w:t xml:space="preserve">   {</w:t>
+      </w:r>
+      <w:proofErr w:type="gramEnd"/>
+      <w:r>
+        <w:rPr>
+          <w:rFonts w:ascii="Consolas" w:eastAsia="Times New Roman" w:hAnsi="Consolas" w:cs="Times New Roman"/>
+          <w:i/>
+          <w:iCs/>
+          <w:color w:val="5F6996"/>
+          <w:sz w:val="21"/>
+          <w:szCs w:val="21"/>
+          <w:lang w:eastAsia="es-419"/>
+        </w:rPr>
+        <w:t xml:space="preserve"> </w:t>
+      </w:r>
+      <w:proofErr w:type="spellStart"/>
+      <w:r>
+        <w:rPr>
+          <w:rFonts w:ascii="Consolas" w:eastAsia="Times New Roman" w:hAnsi="Consolas" w:cs="Times New Roman"/>
+          <w:i/>
+          <w:iCs/>
+          <w:color w:val="5F6996"/>
+          <w:sz w:val="21"/>
+          <w:szCs w:val="21"/>
+          <w:lang w:eastAsia="es-419"/>
+        </w:rPr>
+        <w:t>value</w:t>
+      </w:r>
+      <w:proofErr w:type="spellEnd"/>
+      <w:r>
+        <w:rPr>
+          <w:rFonts w:ascii="Consolas" w:eastAsia="Times New Roman" w:hAnsi="Consolas" w:cs="Times New Roman"/>
+          <w:i/>
+          <w:iCs/>
+          <w:color w:val="5F6996"/>
+          <w:sz w:val="21"/>
+          <w:szCs w:val="21"/>
+          <w:lang w:eastAsia="es-419"/>
+        </w:rPr>
+        <w:t xml:space="preserve">: 'Pioneros', </w:t>
+      </w:r>
+      <w:proofErr w:type="spellStart"/>
+      <w:r>
+        <w:rPr>
+          <w:rFonts w:ascii="Consolas" w:eastAsia="Times New Roman" w:hAnsi="Consolas" w:cs="Times New Roman"/>
+          <w:i/>
+          <w:iCs/>
+          <w:color w:val="5F6996"/>
+          <w:sz w:val="21"/>
+          <w:szCs w:val="21"/>
+          <w:lang w:eastAsia="es-419"/>
+        </w:rPr>
+        <w:t>label</w:t>
+      </w:r>
+      <w:proofErr w:type="spellEnd"/>
+      <w:r>
+        <w:rPr>
+          <w:rFonts w:ascii="Consolas" w:eastAsia="Times New Roman" w:hAnsi="Consolas" w:cs="Times New Roman"/>
+          <w:i/>
+          <w:iCs/>
+          <w:color w:val="5F6996"/>
+          <w:sz w:val="21"/>
+          <w:szCs w:val="21"/>
+          <w:lang w:eastAsia="es-419"/>
+        </w:rPr>
+        <w:t>: 'Pioneros' },</w:t>
+      </w:r>
+    </w:p>
+    <w:p>
+      <w:pPr>
+        <w:shd w:val="clear" w:color="auto" w:fill="24283B"/>
+        <w:spacing w:after="0" w:line="285" w:lineRule="atLeast"/>
+        <w:rPr>
+          <w:rFonts w:ascii="Consolas" w:eastAsia="Times New Roman" w:hAnsi="Consolas" w:cs="Times New Roman"/>
+          <w:color w:val="A9B1D6"/>
+          <w:sz w:val="21"/>
+          <w:szCs w:val="21"/>
+          <w:lang w:val="en-US" w:eastAsia="es-419"/>
+        </w:rPr>
+      </w:pPr>
+      <w:r>
+        <w:rPr>
+          <w:rFonts w:ascii="Consolas" w:eastAsia="Times New Roman" w:hAnsi="Consolas" w:cs="Times New Roman"/>
+          <w:i/>
+          <w:iCs/>
+          <w:color w:val="5F6996"/>
+          <w:sz w:val="21"/>
+          <w:szCs w:val="21"/>
+          <w:lang w:val="en-US" w:eastAsia="es-419"/>
+        </w:rPr>
+        <w:t>//</w:t>
+      </w:r>
+      <w:proofErr w:type="gramStart"/>
+      <w:r>
+        <w:rPr>
+          <w:rFonts w:ascii="Consolas" w:eastAsia="Times New Roman" w:hAnsi="Consolas" w:cs="Times New Roman"/>
+          <w:i/>
+          <w:iCs/>
+          <w:color w:val="5F6996"/>
+          <w:sz w:val="21"/>
+          <w:szCs w:val="21"/>
+          <w:lang w:val="en-US" w:eastAsia="es-419"/>
+        </w:rPr>
+        <w:t xml:space="preserve">   {</w:t>
+      </w:r>
+      <w:proofErr w:type="gramEnd"/>
+      <w:r>
+        <w:rPr>
+          <w:rFonts w:ascii="Consolas" w:eastAsia="Times New Roman" w:hAnsi="Consolas" w:cs="Times New Roman"/>
+          <w:i/>
+          <w:iCs/>
+          <w:color w:val="5F6996"/>
+          <w:sz w:val="21"/>
+          <w:szCs w:val="21"/>
+          <w:lang w:val="en-US" w:eastAsia="es-419"/>
+        </w:rPr>
+        <w:t xml:space="preserve"> value: '</w:t>
+      </w:r>
+      <w:proofErr w:type="spellStart"/>
+      <w:r>
+        <w:rPr>
+          <w:rFonts w:ascii="Consolas" w:eastAsia="Times New Roman" w:hAnsi="Consolas" w:cs="Times New Roman"/>
+          <w:i/>
+          <w:iCs/>
+          <w:color w:val="5F6996"/>
+          <w:sz w:val="21"/>
+          <w:szCs w:val="21"/>
+          <w:lang w:val="en-US" w:eastAsia="es-419"/>
+        </w:rPr>
+        <w:t>Navegantes</w:t>
+      </w:r>
+      <w:proofErr w:type="spellEnd"/>
+      <w:r>
+        <w:rPr>
+          <w:rFonts w:ascii="Consolas" w:eastAsia="Times New Roman" w:hAnsi="Consolas" w:cs="Times New Roman"/>
+          <w:i/>
+          <w:iCs/>
+          <w:color w:val="5F6996"/>
+          <w:sz w:val="21"/>
+          <w:szCs w:val="21"/>
+          <w:lang w:val="en-US" w:eastAsia="es-419"/>
+        </w:rPr>
+        <w:t>', label: '</w:t>
+      </w:r>
+      <w:proofErr w:type="spellStart"/>
+      <w:r>
+        <w:rPr>
+          <w:rFonts w:ascii="Consolas" w:eastAsia="Times New Roman" w:hAnsi="Consolas" w:cs="Times New Roman"/>
+          <w:i/>
+          <w:iCs/>
+          <w:color w:val="5F6996"/>
+          <w:sz w:val="21"/>
+          <w:szCs w:val="21"/>
+          <w:lang w:val="en-US" w:eastAsia="es-419"/>
+        </w:rPr>
+        <w:t>Navegantes</w:t>
+      </w:r>
+      <w:proofErr w:type="spellEnd"/>
+      <w:r>
+        <w:rPr>
+          <w:rFonts w:ascii="Consolas" w:eastAsia="Times New Roman" w:hAnsi="Consolas" w:cs="Times New Roman"/>
+          <w:i/>
+          <w:iCs/>
+          <w:color w:val="5F6996"/>
+          <w:sz w:val="21"/>
+          <w:szCs w:val="21"/>
+          <w:lang w:val="en-US" w:eastAsia="es-419"/>
+        </w:rPr>
+        <w:t>' },</w:t>
+      </w:r>
+    </w:p>
+    <w:p>
+      <w:pPr>
+        <w:shd w:val="clear" w:color="auto" w:fill="24283B"/>
+        <w:spacing w:after="0" w:line="285" w:lineRule="atLeast"/>
+        <w:rPr>
+          <w:rFonts w:ascii="Consolas" w:eastAsia="Times New Roman" w:hAnsi="Consolas" w:cs="Times New Roman"/>
+          <w:color w:val="A9B1D6"/>
+          <w:sz w:val="21"/>
+          <w:szCs w:val="21"/>
+          <w:lang w:val="en-US" w:eastAsia="es-419"/>
+        </w:rPr>
+      </w:pPr>
+      <w:r>
+        <w:rPr>
+          <w:rFonts w:ascii="Consolas" w:eastAsia="Times New Roman" w:hAnsi="Consolas" w:cs="Times New Roman"/>
+          <w:i/>
+          <w:iCs/>
+          <w:color w:val="5F6996"/>
+          <w:sz w:val="21"/>
+          <w:szCs w:val="21"/>
           <w:lang w:val="en-US" w:eastAsia="es-419"/>
         </w:rPr>
         <w:t>// ];</w:t>
@@ -3535,6 +4276,7 @@
         </w:rPr>
         <w:t xml:space="preserve">  </w:t>
       </w:r>
+      <w:proofErr w:type="gramStart"/>
       <w:r>
         <w:rPr>
           <w:rFonts w:ascii="Consolas" w:eastAsia="Times New Roman" w:hAnsi="Consolas" w:cs="Times New Roman"/>
@@ -3567,6 +4309,7 @@
         <w:t>value</w:t>
       </w:r>
       <w:proofErr w:type="spellEnd"/>
+      <w:proofErr w:type="gramEnd"/>
       <w:r>
         <w:rPr>
           <w:rFonts w:ascii="Consolas" w:eastAsia="Times New Roman" w:hAnsi="Consolas" w:cs="Times New Roman"/>
@@ -3744,6 +4487,7 @@
         </w:rPr>
         <w:t xml:space="preserve">  </w:t>
       </w:r>
+      <w:proofErr w:type="gramStart"/>
       <w:r>
         <w:rPr>
           <w:rFonts w:ascii="Consolas" w:eastAsia="Times New Roman" w:hAnsi="Consolas" w:cs="Times New Roman"/>
@@ -3776,6 +4520,7 @@
         <w:t>value</w:t>
       </w:r>
       <w:proofErr w:type="spellEnd"/>
+      <w:proofErr w:type="gramEnd"/>
       <w:r>
         <w:rPr>
           <w:rFonts w:ascii="Consolas" w:eastAsia="Times New Roman" w:hAnsi="Consolas" w:cs="Times New Roman"/>
@@ -3951,6 +4696,7 @@
         </w:rPr>
         <w:t xml:space="preserve">  </w:t>
       </w:r>
+      <w:proofErr w:type="gramStart"/>
       <w:r>
         <w:rPr>
           <w:rFonts w:ascii="Consolas" w:eastAsia="Times New Roman" w:hAnsi="Consolas" w:cs="Times New Roman"/>
@@ -3983,6 +4729,7 @@
         <w:t>value</w:t>
       </w:r>
       <w:proofErr w:type="spellEnd"/>
+      <w:proofErr w:type="gramEnd"/>
       <w:r>
         <w:rPr>
           <w:rFonts w:ascii="Consolas" w:eastAsia="Times New Roman" w:hAnsi="Consolas" w:cs="Times New Roman"/>
@@ -4158,6 +4905,7 @@
         </w:rPr>
         <w:t xml:space="preserve">  </w:t>
       </w:r>
+      <w:proofErr w:type="gramStart"/>
       <w:r>
         <w:rPr>
           <w:rFonts w:ascii="Consolas" w:eastAsia="Times New Roman" w:hAnsi="Consolas" w:cs="Times New Roman"/>
@@ -4190,6 +4938,7 @@
         <w:t>value</w:t>
       </w:r>
       <w:proofErr w:type="spellEnd"/>
+      <w:proofErr w:type="gramEnd"/>
       <w:r>
         <w:rPr>
           <w:rFonts w:ascii="Consolas" w:eastAsia="Times New Roman" w:hAnsi="Consolas" w:cs="Times New Roman"/>
@@ -4365,6 +5114,7 @@
         </w:rPr>
         <w:t xml:space="preserve">  </w:t>
       </w:r>
+      <w:proofErr w:type="gramStart"/>
       <w:r>
         <w:rPr>
           <w:rFonts w:ascii="Consolas" w:eastAsia="Times New Roman" w:hAnsi="Consolas" w:cs="Times New Roman"/>
@@ -4397,6 +5147,7 @@
         <w:t>value</w:t>
       </w:r>
       <w:proofErr w:type="spellEnd"/>
+      <w:proofErr w:type="gramEnd"/>
       <w:r>
         <w:rPr>
           <w:rFonts w:ascii="Consolas" w:eastAsia="Times New Roman" w:hAnsi="Consolas" w:cs="Times New Roman"/>
@@ -4598,6 +5349,467 @@
     </w:sectPr>
   </w:body>
 </w:document>
+</file>
+
+<file path=word/numbering.xml><?xml version="1.0" encoding="utf-8"?>
+<w:numbering xmlns:wpc="http://schemas.microsoft.com/office/word/2010/wordprocessingCanvas" xmlns:cx="http://schemas.microsoft.com/office/drawing/2014/chartex" xmlns:cx1="http://schemas.microsoft.com/office/drawing/2015/9/8/chartex" xmlns:cx2="http://schemas.microsoft.com/office/drawing/2015/10/21/chartex" xmlns:cx3="http://schemas.microsoft.com/office/drawing/2016/5/9/chartex" xmlns:cx4="http://schemas.microsoft.com/office/drawing/2016/5/10/chartex" xmlns:cx5="http://schemas.microsoft.com/office/drawing/2016/5/11/chartex" xmlns:cx6="http://schemas.microsoft.com/office/drawing/2016/5/12/chartex" xmlns:cx7="http://schemas.microsoft.com/office/drawing/2016/5/13/chartex" xmlns:cx8="http://schemas.microsoft.com/office/drawing/2016/5/14/chartex" xmlns:mc="http://schemas.openxmlformats.org/markup-compatibility/2006" xmlns:aink="http://schemas.microsoft.com/office/drawing/2016/ink" xmlns:am3d="http://schemas.microsoft.com/office/drawing/2017/model3d" xmlns:o="urn:schemas-microsoft-com:office:office" xmlns:r="http://schemas.openxmlformats.org/officeDocument/2006/relationships" xmlns:m="http://schemas.openxmlformats.org/officeDocument/2006/math" xmlns:v="urn:schemas-microsoft-com:vml" xmlns:wp14="http://schemas.microsoft.com/office/word/2010/wordprocessingDrawing" xmlns:wp="http://schemas.openxmlformats.org/drawingml/2006/wordprocessingDrawing" xmlns:w10="urn:schemas-microsoft-com:office:word" xmlns:w="http://schemas.openxmlformats.org/wordprocessingml/2006/main" xmlns:w14="http://schemas.microsoft.com/office/word/2010/wordml" xmlns:w15="http://schemas.microsoft.com/office/word/2012/wordml" xmlns:w16cex="http://schemas.microsoft.com/office/word/2018/wordml/cex" xmlns:w16cid="http://schemas.microsoft.com/office/word/2016/wordml/cid" xmlns:w16="http://schemas.microsoft.com/office/word/2018/wordml" xmlns:w16sdtdh="http://schemas.microsoft.com/office/word/2020/wordml/sdtdatahash" xmlns:w16se="http://schemas.microsoft.com/office/word/2015/wordml/symex" xmlns:wpg="http://schemas.microsoft.com/office/word/2010/wordprocessingGroup" xmlns:wpi="http://schemas.microsoft.com/office/word/2010/wordprocessingInk" xmlns:wne="http://schemas.microsoft.com/office/word/2006/wordml" xmlns:wps="http://schemas.microsoft.com/office/word/2010/wordprocessingShape" mc:Ignorable="w14 w15 w16se w16cid w16 w16cex w16sdtdh wp14">
+  <w:abstractNum w:abstractNumId="0" w15:restartNumberingAfterBreak="0">
+    <w:nsid w:val="2E651A6F"/>
+    <w:multiLevelType w:val="multilevel"/>
+    <w:tmpl w:val="AA5635C8"/>
+    <w:lvl w:ilvl="0">
+      <w:start w:val="1"/>
+      <w:numFmt w:val="bullet"/>
+      <w:lvlText w:val=""/>
+      <w:lvlJc w:val="left"/>
+      <w:pPr>
+        <w:tabs>
+          <w:tab w:val="num" w:pos="720"/>
+        </w:tabs>
+        <w:ind w:left="720" w:hanging="360"/>
+      </w:pPr>
+      <w:rPr>
+        <w:rFonts w:ascii="Symbol" w:hAnsi="Symbol" w:hint="default"/>
+        <w:sz w:val="20"/>
+      </w:rPr>
+    </w:lvl>
+    <w:lvl w:ilvl="1" w:tentative="1">
+      <w:start w:val="1"/>
+      <w:numFmt w:val="bullet"/>
+      <w:lvlText w:val="o"/>
+      <w:lvlJc w:val="left"/>
+      <w:pPr>
+        <w:tabs>
+          <w:tab w:val="num" w:pos="1440"/>
+        </w:tabs>
+        <w:ind w:left="1440" w:hanging="360"/>
+      </w:pPr>
+      <w:rPr>
+        <w:rFonts w:ascii="Courier New" w:hAnsi="Courier New" w:hint="default"/>
+        <w:sz w:val="20"/>
+      </w:rPr>
+    </w:lvl>
+    <w:lvl w:ilvl="2" w:tentative="1">
+      <w:start w:val="1"/>
+      <w:numFmt w:val="bullet"/>
+      <w:lvlText w:val=""/>
+      <w:lvlJc w:val="left"/>
+      <w:pPr>
+        <w:tabs>
+          <w:tab w:val="num" w:pos="2160"/>
+        </w:tabs>
+        <w:ind w:left="2160" w:hanging="360"/>
+      </w:pPr>
+      <w:rPr>
+        <w:rFonts w:ascii="Wingdings" w:hAnsi="Wingdings" w:hint="default"/>
+        <w:sz w:val="20"/>
+      </w:rPr>
+    </w:lvl>
+    <w:lvl w:ilvl="3" w:tentative="1">
+      <w:start w:val="1"/>
+      <w:numFmt w:val="bullet"/>
+      <w:lvlText w:val=""/>
+      <w:lvlJc w:val="left"/>
+      <w:pPr>
+        <w:tabs>
+          <w:tab w:val="num" w:pos="2880"/>
+        </w:tabs>
+        <w:ind w:left="2880" w:hanging="360"/>
+      </w:pPr>
+      <w:rPr>
+        <w:rFonts w:ascii="Wingdings" w:hAnsi="Wingdings" w:hint="default"/>
+        <w:sz w:val="20"/>
+      </w:rPr>
+    </w:lvl>
+    <w:lvl w:ilvl="4" w:tentative="1">
+      <w:start w:val="1"/>
+      <w:numFmt w:val="bullet"/>
+      <w:lvlText w:val=""/>
+      <w:lvlJc w:val="left"/>
+      <w:pPr>
+        <w:tabs>
+          <w:tab w:val="num" w:pos="3600"/>
+        </w:tabs>
+        <w:ind w:left="3600" w:hanging="360"/>
+      </w:pPr>
+      <w:rPr>
+        <w:rFonts w:ascii="Wingdings" w:hAnsi="Wingdings" w:hint="default"/>
+        <w:sz w:val="20"/>
+      </w:rPr>
+    </w:lvl>
+    <w:lvl w:ilvl="5" w:tentative="1">
+      <w:start w:val="1"/>
+      <w:numFmt w:val="bullet"/>
+      <w:lvlText w:val=""/>
+      <w:lvlJc w:val="left"/>
+      <w:pPr>
+        <w:tabs>
+          <w:tab w:val="num" w:pos="4320"/>
+        </w:tabs>
+        <w:ind w:left="4320" w:hanging="360"/>
+      </w:pPr>
+      <w:rPr>
+        <w:rFonts w:ascii="Wingdings" w:hAnsi="Wingdings" w:hint="default"/>
+        <w:sz w:val="20"/>
+      </w:rPr>
+    </w:lvl>
+    <w:lvl w:ilvl="6" w:tentative="1">
+      <w:start w:val="1"/>
+      <w:numFmt w:val="bullet"/>
+      <w:lvlText w:val=""/>
+      <w:lvlJc w:val="left"/>
+      <w:pPr>
+        <w:tabs>
+          <w:tab w:val="num" w:pos="5040"/>
+        </w:tabs>
+        <w:ind w:left="5040" w:hanging="360"/>
+      </w:pPr>
+      <w:rPr>
+        <w:rFonts w:ascii="Wingdings" w:hAnsi="Wingdings" w:hint="default"/>
+        <w:sz w:val="20"/>
+      </w:rPr>
+    </w:lvl>
+    <w:lvl w:ilvl="7" w:tentative="1">
+      <w:start w:val="1"/>
+      <w:numFmt w:val="bullet"/>
+      <w:lvlText w:val=""/>
+      <w:lvlJc w:val="left"/>
+      <w:pPr>
+        <w:tabs>
+          <w:tab w:val="num" w:pos="5760"/>
+        </w:tabs>
+        <w:ind w:left="5760" w:hanging="360"/>
+      </w:pPr>
+      <w:rPr>
+        <w:rFonts w:ascii="Wingdings" w:hAnsi="Wingdings" w:hint="default"/>
+        <w:sz w:val="20"/>
+      </w:rPr>
+    </w:lvl>
+    <w:lvl w:ilvl="8" w:tentative="1">
+      <w:start w:val="1"/>
+      <w:numFmt w:val="bullet"/>
+      <w:lvlText w:val=""/>
+      <w:lvlJc w:val="left"/>
+      <w:pPr>
+        <w:tabs>
+          <w:tab w:val="num" w:pos="6480"/>
+        </w:tabs>
+        <w:ind w:left="6480" w:hanging="360"/>
+      </w:pPr>
+      <w:rPr>
+        <w:rFonts w:ascii="Wingdings" w:hAnsi="Wingdings" w:hint="default"/>
+        <w:sz w:val="20"/>
+      </w:rPr>
+    </w:lvl>
+  </w:abstractNum>
+  <w:abstractNum w:abstractNumId="1" w15:restartNumberingAfterBreak="0">
+    <w:nsid w:val="304B6DE4"/>
+    <w:multiLevelType w:val="multilevel"/>
+    <w:tmpl w:val="3118AF52"/>
+    <w:lvl w:ilvl="0">
+      <w:start w:val="1"/>
+      <w:numFmt w:val="bullet"/>
+      <w:lvlText w:val=""/>
+      <w:lvlJc w:val="left"/>
+      <w:pPr>
+        <w:tabs>
+          <w:tab w:val="num" w:pos="720"/>
+        </w:tabs>
+        <w:ind w:left="720" w:hanging="360"/>
+      </w:pPr>
+      <w:rPr>
+        <w:rFonts w:ascii="Symbol" w:hAnsi="Symbol" w:hint="default"/>
+        <w:sz w:val="20"/>
+      </w:rPr>
+    </w:lvl>
+    <w:lvl w:ilvl="1" w:tentative="1">
+      <w:start w:val="1"/>
+      <w:numFmt w:val="bullet"/>
+      <w:lvlText w:val="o"/>
+      <w:lvlJc w:val="left"/>
+      <w:pPr>
+        <w:tabs>
+          <w:tab w:val="num" w:pos="1440"/>
+        </w:tabs>
+        <w:ind w:left="1440" w:hanging="360"/>
+      </w:pPr>
+      <w:rPr>
+        <w:rFonts w:ascii="Courier New" w:hAnsi="Courier New" w:hint="default"/>
+        <w:sz w:val="20"/>
+      </w:rPr>
+    </w:lvl>
+    <w:lvl w:ilvl="2" w:tentative="1">
+      <w:start w:val="1"/>
+      <w:numFmt w:val="bullet"/>
+      <w:lvlText w:val=""/>
+      <w:lvlJc w:val="left"/>
+      <w:pPr>
+        <w:tabs>
+          <w:tab w:val="num" w:pos="2160"/>
+        </w:tabs>
+        <w:ind w:left="2160" w:hanging="360"/>
+      </w:pPr>
+      <w:rPr>
+        <w:rFonts w:ascii="Wingdings" w:hAnsi="Wingdings" w:hint="default"/>
+        <w:sz w:val="20"/>
+      </w:rPr>
+    </w:lvl>
+    <w:lvl w:ilvl="3" w:tentative="1">
+      <w:start w:val="1"/>
+      <w:numFmt w:val="bullet"/>
+      <w:lvlText w:val=""/>
+      <w:lvlJc w:val="left"/>
+      <w:pPr>
+        <w:tabs>
+          <w:tab w:val="num" w:pos="2880"/>
+        </w:tabs>
+        <w:ind w:left="2880" w:hanging="360"/>
+      </w:pPr>
+      <w:rPr>
+        <w:rFonts w:ascii="Wingdings" w:hAnsi="Wingdings" w:hint="default"/>
+        <w:sz w:val="20"/>
+      </w:rPr>
+    </w:lvl>
+    <w:lvl w:ilvl="4" w:tentative="1">
+      <w:start w:val="1"/>
+      <w:numFmt w:val="bullet"/>
+      <w:lvlText w:val=""/>
+      <w:lvlJc w:val="left"/>
+      <w:pPr>
+        <w:tabs>
+          <w:tab w:val="num" w:pos="3600"/>
+        </w:tabs>
+        <w:ind w:left="3600" w:hanging="360"/>
+      </w:pPr>
+      <w:rPr>
+        <w:rFonts w:ascii="Wingdings" w:hAnsi="Wingdings" w:hint="default"/>
+        <w:sz w:val="20"/>
+      </w:rPr>
+    </w:lvl>
+    <w:lvl w:ilvl="5" w:tentative="1">
+      <w:start w:val="1"/>
+      <w:numFmt w:val="bullet"/>
+      <w:lvlText w:val=""/>
+      <w:lvlJc w:val="left"/>
+      <w:pPr>
+        <w:tabs>
+          <w:tab w:val="num" w:pos="4320"/>
+        </w:tabs>
+        <w:ind w:left="4320" w:hanging="360"/>
+      </w:pPr>
+      <w:rPr>
+        <w:rFonts w:ascii="Wingdings" w:hAnsi="Wingdings" w:hint="default"/>
+        <w:sz w:val="20"/>
+      </w:rPr>
+    </w:lvl>
+    <w:lvl w:ilvl="6" w:tentative="1">
+      <w:start w:val="1"/>
+      <w:numFmt w:val="bullet"/>
+      <w:lvlText w:val=""/>
+      <w:lvlJc w:val="left"/>
+      <w:pPr>
+        <w:tabs>
+          <w:tab w:val="num" w:pos="5040"/>
+        </w:tabs>
+        <w:ind w:left="5040" w:hanging="360"/>
+      </w:pPr>
+      <w:rPr>
+        <w:rFonts w:ascii="Wingdings" w:hAnsi="Wingdings" w:hint="default"/>
+        <w:sz w:val="20"/>
+      </w:rPr>
+    </w:lvl>
+    <w:lvl w:ilvl="7" w:tentative="1">
+      <w:start w:val="1"/>
+      <w:numFmt w:val="bullet"/>
+      <w:lvlText w:val=""/>
+      <w:lvlJc w:val="left"/>
+      <w:pPr>
+        <w:tabs>
+          <w:tab w:val="num" w:pos="5760"/>
+        </w:tabs>
+        <w:ind w:left="5760" w:hanging="360"/>
+      </w:pPr>
+      <w:rPr>
+        <w:rFonts w:ascii="Wingdings" w:hAnsi="Wingdings" w:hint="default"/>
+        <w:sz w:val="20"/>
+      </w:rPr>
+    </w:lvl>
+    <w:lvl w:ilvl="8" w:tentative="1">
+      <w:start w:val="1"/>
+      <w:numFmt w:val="bullet"/>
+      <w:lvlText w:val=""/>
+      <w:lvlJc w:val="left"/>
+      <w:pPr>
+        <w:tabs>
+          <w:tab w:val="num" w:pos="6480"/>
+        </w:tabs>
+        <w:ind w:left="6480" w:hanging="360"/>
+      </w:pPr>
+      <w:rPr>
+        <w:rFonts w:ascii="Wingdings" w:hAnsi="Wingdings" w:hint="default"/>
+        <w:sz w:val="20"/>
+      </w:rPr>
+    </w:lvl>
+  </w:abstractNum>
+  <w:abstractNum w:abstractNumId="2" w15:restartNumberingAfterBreak="0">
+    <w:nsid w:val="36B85EC0"/>
+    <w:multiLevelType w:val="multilevel"/>
+    <w:tmpl w:val="6246A048"/>
+    <w:lvl w:ilvl="0">
+      <w:start w:val="1"/>
+      <w:numFmt w:val="bullet"/>
+      <w:lvlText w:val=""/>
+      <w:lvlJc w:val="left"/>
+      <w:pPr>
+        <w:tabs>
+          <w:tab w:val="num" w:pos="720"/>
+        </w:tabs>
+        <w:ind w:left="720" w:hanging="360"/>
+      </w:pPr>
+      <w:rPr>
+        <w:rFonts w:ascii="Symbol" w:hAnsi="Symbol" w:hint="default"/>
+        <w:sz w:val="20"/>
+      </w:rPr>
+    </w:lvl>
+    <w:lvl w:ilvl="1" w:tentative="1">
+      <w:start w:val="1"/>
+      <w:numFmt w:val="bullet"/>
+      <w:lvlText w:val="o"/>
+      <w:lvlJc w:val="left"/>
+      <w:pPr>
+        <w:tabs>
+          <w:tab w:val="num" w:pos="1440"/>
+        </w:tabs>
+        <w:ind w:left="1440" w:hanging="360"/>
+      </w:pPr>
+      <w:rPr>
+        <w:rFonts w:ascii="Courier New" w:hAnsi="Courier New" w:hint="default"/>
+        <w:sz w:val="20"/>
+      </w:rPr>
+    </w:lvl>
+    <w:lvl w:ilvl="2" w:tentative="1">
+      <w:start w:val="1"/>
+      <w:numFmt w:val="bullet"/>
+      <w:lvlText w:val=""/>
+      <w:lvlJc w:val="left"/>
+      <w:pPr>
+        <w:tabs>
+          <w:tab w:val="num" w:pos="2160"/>
+        </w:tabs>
+        <w:ind w:left="2160" w:hanging="360"/>
+      </w:pPr>
+      <w:rPr>
+        <w:rFonts w:ascii="Wingdings" w:hAnsi="Wingdings" w:hint="default"/>
+        <w:sz w:val="20"/>
+      </w:rPr>
+    </w:lvl>
+    <w:lvl w:ilvl="3" w:tentative="1">
+      <w:start w:val="1"/>
+      <w:numFmt w:val="bullet"/>
+      <w:lvlText w:val=""/>
+      <w:lvlJc w:val="left"/>
+      <w:pPr>
+        <w:tabs>
+          <w:tab w:val="num" w:pos="2880"/>
+        </w:tabs>
+        <w:ind w:left="2880" w:hanging="360"/>
+      </w:pPr>
+      <w:rPr>
+        <w:rFonts w:ascii="Wingdings" w:hAnsi="Wingdings" w:hint="default"/>
+        <w:sz w:val="20"/>
+      </w:rPr>
+    </w:lvl>
+    <w:lvl w:ilvl="4" w:tentative="1">
+      <w:start w:val="1"/>
+      <w:numFmt w:val="bullet"/>
+      <w:lvlText w:val=""/>
+      <w:lvlJc w:val="left"/>
+      <w:pPr>
+        <w:tabs>
+          <w:tab w:val="num" w:pos="3600"/>
+        </w:tabs>
+        <w:ind w:left="3600" w:hanging="360"/>
+      </w:pPr>
+      <w:rPr>
+        <w:rFonts w:ascii="Wingdings" w:hAnsi="Wingdings" w:hint="default"/>
+        <w:sz w:val="20"/>
+      </w:rPr>
+    </w:lvl>
+    <w:lvl w:ilvl="5" w:tentative="1">
+      <w:start w:val="1"/>
+      <w:numFmt w:val="bullet"/>
+      <w:lvlText w:val=""/>
+      <w:lvlJc w:val="left"/>
+      <w:pPr>
+        <w:tabs>
+          <w:tab w:val="num" w:pos="4320"/>
+        </w:tabs>
+        <w:ind w:left="4320" w:hanging="360"/>
+      </w:pPr>
+      <w:rPr>
+        <w:rFonts w:ascii="Wingdings" w:hAnsi="Wingdings" w:hint="default"/>
+        <w:sz w:val="20"/>
+      </w:rPr>
+    </w:lvl>
+    <w:lvl w:ilvl="6" w:tentative="1">
+      <w:start w:val="1"/>
+      <w:numFmt w:val="bullet"/>
+      <w:lvlText w:val=""/>
+      <w:lvlJc w:val="left"/>
+      <w:pPr>
+        <w:tabs>
+          <w:tab w:val="num" w:pos="5040"/>
+        </w:tabs>
+        <w:ind w:left="5040" w:hanging="360"/>
+      </w:pPr>
+      <w:rPr>
+        <w:rFonts w:ascii="Wingdings" w:hAnsi="Wingdings" w:hint="default"/>
+        <w:sz w:val="20"/>
+      </w:rPr>
+    </w:lvl>
+    <w:lvl w:ilvl="7" w:tentative="1">
+      <w:start w:val="1"/>
+      <w:numFmt w:val="bullet"/>
+      <w:lvlText w:val=""/>
+      <w:lvlJc w:val="left"/>
+      <w:pPr>
+        <w:tabs>
+          <w:tab w:val="num" w:pos="5760"/>
+        </w:tabs>
+        <w:ind w:left="5760" w:hanging="360"/>
+      </w:pPr>
+      <w:rPr>
+        <w:rFonts w:ascii="Wingdings" w:hAnsi="Wingdings" w:hint="default"/>
+        <w:sz w:val="20"/>
+      </w:rPr>
+    </w:lvl>
+    <w:lvl w:ilvl="8" w:tentative="1">
+      <w:start w:val="1"/>
+      <w:numFmt w:val="bullet"/>
+      <w:lvlText w:val=""/>
+      <w:lvlJc w:val="left"/>
+      <w:pPr>
+        <w:tabs>
+          <w:tab w:val="num" w:pos="6480"/>
+        </w:tabs>
+        <w:ind w:left="6480" w:hanging="360"/>
+      </w:pPr>
+      <w:rPr>
+        <w:rFonts w:ascii="Wingdings" w:hAnsi="Wingdings" w:hint="default"/>
+        <w:sz w:val="20"/>
+      </w:rPr>
+    </w:lvl>
+  </w:abstractNum>
+  <w:num w:numId="1">
+    <w:abstractNumId w:val="1"/>
+  </w:num>
+  <w:num w:numId="2">
+    <w:abstractNumId w:val="2"/>
+  </w:num>
+  <w:num w:numId="3">
+    <w:abstractNumId w:val="0"/>
+  </w:num>
+</w:numbering>
 </file>
 
 <file path=word/styles.xml><?xml version="1.0" encoding="utf-8"?>
@@ -4999,6 +6211,26 @@
     <w:name w:val="Normal"/>
     <w:qFormat/>
   </w:style>
+  <w:style w:type="paragraph" w:styleId="Heading3">
+    <w:name w:val="heading 3"/>
+    <w:basedOn w:val="Normal"/>
+    <w:link w:val="Heading3Char"/>
+    <w:uiPriority w:val="9"/>
+    <w:qFormat/>
+    <w:rsid w:val="00AB6D83"/>
+    <w:pPr>
+      <w:spacing w:before="100" w:beforeAutospacing="1" w:after="100" w:afterAutospacing="1" w:line="240" w:lineRule="auto"/>
+      <w:outlineLvl w:val="2"/>
+    </w:pPr>
+    <w:rPr>
+      <w:rFonts w:ascii="Times New Roman" w:eastAsia="Times New Roman" w:hAnsi="Times New Roman" w:cs="Times New Roman"/>
+      <w:b/>
+      <w:bCs/>
+      <w:sz w:val="27"/>
+      <w:szCs w:val="27"/>
+      <w:lang w:eastAsia="es-419"/>
+    </w:rPr>
+  </w:style>
   <w:style w:type="character" w:default="1" w:styleId="DefaultParagraphFont">
     <w:name w:val="Default Paragraph Font"/>
     <w:uiPriority w:val="1"/>
@@ -5025,6 +6257,62 @@
     <w:uiPriority w:val="99"/>
     <w:semiHidden/>
     <w:unhideWhenUsed/>
+  </w:style>
+  <w:style w:type="character" w:customStyle="1" w:styleId="Heading3Char">
+    <w:name w:val="Heading 3 Char"/>
+    <w:basedOn w:val="DefaultParagraphFont"/>
+    <w:link w:val="Heading3"/>
+    <w:uiPriority w:val="9"/>
+    <w:rsid w:val="00AB6D83"/>
+    <w:rPr>
+      <w:rFonts w:ascii="Times New Roman" w:eastAsia="Times New Roman" w:hAnsi="Times New Roman" w:cs="Times New Roman"/>
+      <w:b/>
+      <w:bCs/>
+      <w:sz w:val="27"/>
+      <w:szCs w:val="27"/>
+      <w:lang w:eastAsia="es-419"/>
+    </w:rPr>
+  </w:style>
+  <w:style w:type="character" w:styleId="Strong">
+    <w:name w:val="Strong"/>
+    <w:basedOn w:val="DefaultParagraphFont"/>
+    <w:uiPriority w:val="22"/>
+    <w:qFormat/>
+    <w:rsid w:val="00AB6D83"/>
+    <w:rPr>
+      <w:b/>
+      <w:bCs/>
+    </w:rPr>
+  </w:style>
+  <w:style w:type="character" w:styleId="HTMLCode">
+    <w:name w:val="HTML Code"/>
+    <w:basedOn w:val="DefaultParagraphFont"/>
+    <w:uiPriority w:val="99"/>
+    <w:semiHidden/>
+    <w:unhideWhenUsed/>
+    <w:rsid w:val="00AB6D83"/>
+    <w:rPr>
+      <w:rFonts w:ascii="Courier New" w:eastAsia="Times New Roman" w:hAnsi="Courier New" w:cs="Courier New"/>
+      <w:sz w:val="20"/>
+      <w:szCs w:val="20"/>
+    </w:rPr>
+  </w:style>
+  <w:style w:type="paragraph" w:styleId="NormalWeb">
+    <w:name w:val="Normal (Web)"/>
+    <w:basedOn w:val="Normal"/>
+    <w:uiPriority w:val="99"/>
+    <w:semiHidden/>
+    <w:unhideWhenUsed/>
+    <w:rsid w:val="00AB6D83"/>
+    <w:pPr>
+      <w:spacing w:before="100" w:beforeAutospacing="1" w:after="100" w:afterAutospacing="1" w:line="240" w:lineRule="auto"/>
+    </w:pPr>
+    <w:rPr>
+      <w:rFonts w:ascii="Times New Roman" w:eastAsia="Times New Roman" w:hAnsi="Times New Roman" w:cs="Times New Roman"/>
+      <w:sz w:val="24"/>
+      <w:szCs w:val="24"/>
+      <w:lang w:eastAsia="es-419"/>
+    </w:rPr>
   </w:style>
 </w:styles>
 </file>

</xml_diff>

<commit_message>
adding multiple values to national searchbar
</commit_message>
<xml_diff>
--- a/Cambios de valores/Filtro superior horizontal.docx
+++ b/Cambios de valores/Filtro superior horizontal.docx
@@ -38,7 +38,7 @@
           <w:bCs/>
           <w:sz w:val="27"/>
           <w:szCs w:val="27"/>
-          <w:lang w:eastAsia="es-419"/>
+          <w:lang w:val="en-US" w:eastAsia="es-419"/>
         </w:rPr>
       </w:pPr>
       <w:proofErr w:type="spellStart"/>
@@ -49,7 +49,7 @@
           <w:bCs/>
           <w:sz w:val="20"/>
           <w:szCs w:val="20"/>
-          <w:lang w:eastAsia="es-419"/>
+          <w:lang w:val="en-US" w:eastAsia="es-419"/>
         </w:rPr>
         <w:t>MemberListView.jsx</w:t>
       </w:r>
@@ -57,10 +57,6 @@
     </w:p>
     <w:p>
       <w:pPr>
-        <w:numPr>
-          <w:ilvl w:val="0"/>
-          <w:numId w:val="1"/>
-        </w:numPr>
         <w:spacing w:before="100" w:beforeAutospacing="1" w:after="100" w:afterAutospacing="1" w:line="240" w:lineRule="auto"/>
         <w:rPr>
           <w:rFonts w:ascii="Times New Roman" w:eastAsia="Times New Roman" w:hAnsi="Times New Roman" w:cs="Times New Roman"/>
@@ -71,23 +67,116 @@
       </w:pPr>
       <w:r>
         <w:rPr>
+          <w:rFonts w:ascii="Times New Roman" w:eastAsia="Times New Roman" w:hAnsi="Times New Roman" w:cs="Times New Roman"/>
+          <w:sz w:val="24"/>
+          <w:szCs w:val="24"/>
+          <w:highlight w:val="yellow"/>
+          <w:lang w:val="en-US" w:eastAsia="es-419"/>
+        </w:rPr>
+        <w:t>Tabs (</w:t>
+      </w:r>
+      <w:proofErr w:type="spellStart"/>
+      <w:r>
+        <w:rPr>
+          <w:rFonts w:ascii="Times New Roman" w:eastAsia="Times New Roman" w:hAnsi="Times New Roman" w:cs="Times New Roman"/>
+          <w:sz w:val="24"/>
+          <w:szCs w:val="24"/>
+          <w:highlight w:val="yellow"/>
+          <w:lang w:val="en-US" w:eastAsia="es-419"/>
+        </w:rPr>
+        <w:t>conteo</w:t>
+      </w:r>
+      <w:proofErr w:type="spellEnd"/>
+      <w:r>
+        <w:rPr>
+          <w:rFonts w:ascii="Times New Roman" w:eastAsia="Times New Roman" w:hAnsi="Times New Roman" w:cs="Times New Roman"/>
+          <w:sz w:val="24"/>
+          <w:szCs w:val="24"/>
+          <w:highlight w:val="yellow"/>
+          <w:lang w:val="en-US" w:eastAsia="es-419"/>
+        </w:rPr>
+        <w:t xml:space="preserve"> por </w:t>
+      </w:r>
+      <w:proofErr w:type="spellStart"/>
+      <w:r>
+        <w:rPr>
+          <w:rFonts w:ascii="Times New Roman" w:eastAsia="Times New Roman" w:hAnsi="Times New Roman" w:cs="Times New Roman"/>
+          <w:sz w:val="24"/>
+          <w:szCs w:val="24"/>
+          <w:highlight w:val="yellow"/>
+          <w:lang w:val="en-US" w:eastAsia="es-419"/>
+        </w:rPr>
+        <w:t>división</w:t>
+      </w:r>
+      <w:proofErr w:type="spellEnd"/>
+      <w:r>
+        <w:rPr>
+          <w:rFonts w:ascii="Times New Roman" w:eastAsia="Times New Roman" w:hAnsi="Times New Roman" w:cs="Times New Roman"/>
+          <w:sz w:val="24"/>
+          <w:szCs w:val="24"/>
+          <w:highlight w:val="yellow"/>
+          <w:lang w:val="en-US" w:eastAsia="es-419"/>
+        </w:rPr>
+        <w:t>):</w:t>
+      </w:r>
+      <w:r>
+        <w:rPr>
+          <w:rFonts w:ascii="Times New Roman" w:eastAsia="Times New Roman" w:hAnsi="Times New Roman" w:cs="Times New Roman"/>
+          <w:sz w:val="24"/>
+          <w:szCs w:val="24"/>
+          <w:highlight w:val="yellow"/>
+          <w:lang w:val="en-US" w:eastAsia="es-419"/>
+        </w:rPr>
+        <w:br/>
+      </w:r>
+      <w:proofErr w:type="spellStart"/>
+      <w:proofErr w:type="gramStart"/>
+      <w:r>
+        <w:rPr>
           <w:rFonts w:ascii="Courier New" w:eastAsia="Times New Roman" w:hAnsi="Courier New" w:cs="Courier New"/>
           <w:sz w:val="20"/>
           <w:szCs w:val="20"/>
-          <w:lang w:val="en-US" w:eastAsia="es-419"/>
-        </w:rPr>
-        <w:t>TABLE_HEAD</w:t>
-      </w:r>
-      <w:r>
+          <w:highlight w:val="yellow"/>
+          <w:lang w:val="en-US" w:eastAsia="es-419"/>
+        </w:rPr>
+        <w:t>member.memberDivision</w:t>
+      </w:r>
+      <w:proofErr w:type="spellEnd"/>
+      <w:proofErr w:type="gramEnd"/>
+      <w:r>
+        <w:rPr>
+          <w:rFonts w:ascii="Courier New" w:eastAsia="Times New Roman" w:hAnsi="Courier New" w:cs="Courier New"/>
+          <w:sz w:val="20"/>
+          <w:szCs w:val="20"/>
+          <w:highlight w:val="yellow"/>
+          <w:lang w:val="en-US" w:eastAsia="es-419"/>
+        </w:rPr>
+        <w:t xml:space="preserve"> === </w:t>
+      </w:r>
+      <w:proofErr w:type="spellStart"/>
+      <w:r>
+        <w:rPr>
+          <w:rFonts w:ascii="Courier New" w:eastAsia="Times New Roman" w:hAnsi="Courier New" w:cs="Courier New"/>
+          <w:sz w:val="20"/>
+          <w:szCs w:val="20"/>
+          <w:highlight w:val="yellow"/>
+          <w:lang w:val="en-US" w:eastAsia="es-419"/>
+        </w:rPr>
+        <w:t>tab.value</w:t>
+      </w:r>
+      <w:proofErr w:type="spellEnd"/>
+    </w:p>
+    <w:p>
+      <w:pPr>
+        <w:spacing w:before="100" w:beforeAutospacing="1" w:after="100" w:afterAutospacing="1" w:line="240" w:lineRule="auto"/>
         <w:rPr>
           <w:rFonts w:ascii="Times New Roman" w:eastAsia="Times New Roman" w:hAnsi="Times New Roman" w:cs="Times New Roman"/>
           <w:sz w:val="24"/>
           <w:szCs w:val="24"/>
           <w:lang w:val="en-US" w:eastAsia="es-419"/>
         </w:rPr>
-        <w:t xml:space="preserve">: </w:t>
-      </w:r>
-      <w:proofErr w:type="gramStart"/>
+      </w:pPr>
+      <w:proofErr w:type="spellStart"/>
       <w:r>
         <w:rPr>
           <w:rFonts w:ascii="Courier New" w:eastAsia="Times New Roman" w:hAnsi="Courier New" w:cs="Courier New"/>
@@ -95,227 +184,98 @@
           <w:szCs w:val="20"/>
           <w:lang w:val="en-US" w:eastAsia="es-419"/>
         </w:rPr>
-        <w:t>{ id</w:t>
-      </w:r>
-      <w:proofErr w:type="gramEnd"/>
+        <w:t>applyFilter</w:t>
+      </w:r>
+      <w:proofErr w:type="spellEnd"/>
+      <w:r>
+        <w:rPr>
+          <w:rFonts w:ascii="Times New Roman" w:eastAsia="Times New Roman" w:hAnsi="Times New Roman" w:cs="Times New Roman"/>
+          <w:sz w:val="24"/>
+          <w:szCs w:val="24"/>
+          <w:lang w:val="en-US" w:eastAsia="es-419"/>
+        </w:rPr>
+        <w:t xml:space="preserve"> (</w:t>
+      </w:r>
+      <w:proofErr w:type="spellStart"/>
+      <w:r>
+        <w:rPr>
+          <w:rFonts w:ascii="Times New Roman" w:eastAsia="Times New Roman" w:hAnsi="Times New Roman" w:cs="Times New Roman"/>
+          <w:sz w:val="24"/>
+          <w:szCs w:val="24"/>
+          <w:lang w:val="en-US" w:eastAsia="es-419"/>
+        </w:rPr>
+        <w:t>filtro</w:t>
+      </w:r>
+      <w:proofErr w:type="spellEnd"/>
+      <w:r>
+        <w:rPr>
+          <w:rFonts w:ascii="Times New Roman" w:eastAsia="Times New Roman" w:hAnsi="Times New Roman" w:cs="Times New Roman"/>
+          <w:sz w:val="24"/>
+          <w:szCs w:val="24"/>
+          <w:lang w:val="en-US" w:eastAsia="es-419"/>
+        </w:rPr>
+        <w:t xml:space="preserve"> por </w:t>
+      </w:r>
+      <w:proofErr w:type="spellStart"/>
+      <w:r>
+        <w:rPr>
+          <w:rFonts w:ascii="Times New Roman" w:eastAsia="Times New Roman" w:hAnsi="Times New Roman" w:cs="Times New Roman"/>
+          <w:sz w:val="24"/>
+          <w:szCs w:val="24"/>
+          <w:lang w:val="en-US" w:eastAsia="es-419"/>
+        </w:rPr>
+        <w:t>división</w:t>
+      </w:r>
+      <w:proofErr w:type="spellEnd"/>
+      <w:r>
+        <w:rPr>
+          <w:rFonts w:ascii="Times New Roman" w:eastAsia="Times New Roman" w:hAnsi="Times New Roman" w:cs="Times New Roman"/>
+          <w:sz w:val="24"/>
+          <w:szCs w:val="24"/>
+          <w:lang w:val="en-US" w:eastAsia="es-419"/>
+        </w:rPr>
+        <w:t>):</w:t>
+      </w:r>
+      <w:r>
+        <w:rPr>
+          <w:rFonts w:ascii="Times New Roman" w:eastAsia="Times New Roman" w:hAnsi="Times New Roman" w:cs="Times New Roman"/>
+          <w:sz w:val="24"/>
+          <w:szCs w:val="24"/>
+          <w:lang w:val="en-US" w:eastAsia="es-419"/>
+        </w:rPr>
+        <w:br/>
+      </w:r>
+      <w:proofErr w:type="spellStart"/>
+      <w:proofErr w:type="gramStart"/>
       <w:r>
         <w:rPr>
           <w:rFonts w:ascii="Courier New" w:eastAsia="Times New Roman" w:hAnsi="Courier New" w:cs="Courier New"/>
           <w:sz w:val="20"/>
           <w:szCs w:val="20"/>
-          <w:lang w:val="en-US" w:eastAsia="es-419"/>
-        </w:rPr>
-        <w:t>: '</w:t>
-      </w:r>
-      <w:proofErr w:type="spellStart"/>
+          <w:highlight w:val="yellow"/>
+          <w:lang w:val="en-US" w:eastAsia="es-419"/>
+        </w:rPr>
+        <w:t>member.memberDivision</w:t>
+      </w:r>
+      <w:proofErr w:type="spellEnd"/>
+      <w:proofErr w:type="gramEnd"/>
       <w:r>
         <w:rPr>
           <w:rFonts w:ascii="Courier New" w:eastAsia="Times New Roman" w:hAnsi="Courier New" w:cs="Courier New"/>
           <w:sz w:val="20"/>
           <w:szCs w:val="20"/>
-          <w:lang w:val="en-US" w:eastAsia="es-419"/>
-        </w:rPr>
-        <w:t>memberDivision</w:t>
-      </w:r>
-      <w:proofErr w:type="spellEnd"/>
+          <w:highlight w:val="yellow"/>
+          <w:lang w:val="en-US" w:eastAsia="es-419"/>
+        </w:rPr>
+        <w:t xml:space="preserve"> === </w:t>
+      </w:r>
+      <w:proofErr w:type="spellStart"/>
       <w:r>
         <w:rPr>
           <w:rFonts w:ascii="Courier New" w:eastAsia="Times New Roman" w:hAnsi="Courier New" w:cs="Courier New"/>
           <w:sz w:val="20"/>
           <w:szCs w:val="20"/>
-          <w:lang w:val="en-US" w:eastAsia="es-419"/>
-        </w:rPr>
-        <w:t>', label: 'División', width: 170 }</w:t>
-      </w:r>
-    </w:p>
-    <w:p>
-      <w:pPr>
-        <w:numPr>
-          <w:ilvl w:val="0"/>
-          <w:numId w:val="1"/>
-        </w:numPr>
-        <w:spacing w:before="100" w:beforeAutospacing="1" w:after="100" w:afterAutospacing="1" w:line="240" w:lineRule="auto"/>
-        <w:rPr>
-          <w:rFonts w:ascii="Times New Roman" w:eastAsia="Times New Roman" w:hAnsi="Times New Roman" w:cs="Times New Roman"/>
-          <w:sz w:val="24"/>
-          <w:szCs w:val="24"/>
-          <w:lang w:eastAsia="es-419"/>
-        </w:rPr>
-      </w:pPr>
-      <w:proofErr w:type="spellStart"/>
-      <w:r>
-        <w:rPr>
-          <w:rFonts w:ascii="Times New Roman" w:eastAsia="Times New Roman" w:hAnsi="Times New Roman" w:cs="Times New Roman"/>
-          <w:sz w:val="24"/>
-          <w:szCs w:val="24"/>
-          <w:lang w:eastAsia="es-419"/>
-        </w:rPr>
-        <w:t>Tabs</w:t>
-      </w:r>
-      <w:proofErr w:type="spellEnd"/>
-      <w:r>
-        <w:rPr>
-          <w:rFonts w:ascii="Times New Roman" w:eastAsia="Times New Roman" w:hAnsi="Times New Roman" w:cs="Times New Roman"/>
-          <w:sz w:val="24"/>
-          <w:szCs w:val="24"/>
-          <w:lang w:eastAsia="es-419"/>
-        </w:rPr>
-        <w:t xml:space="preserve"> (conteo por división):</w:t>
-      </w:r>
-      <w:r>
-        <w:rPr>
-          <w:rFonts w:ascii="Times New Roman" w:eastAsia="Times New Roman" w:hAnsi="Times New Roman" w:cs="Times New Roman"/>
-          <w:sz w:val="24"/>
-          <w:szCs w:val="24"/>
-          <w:lang w:eastAsia="es-419"/>
-        </w:rPr>
-        <w:br/>
-      </w:r>
-      <w:proofErr w:type="spellStart"/>
-      <w:proofErr w:type="gramStart"/>
-      <w:r>
-        <w:rPr>
-          <w:rFonts w:ascii="Courier New" w:eastAsia="Times New Roman" w:hAnsi="Courier New" w:cs="Courier New"/>
-          <w:sz w:val="20"/>
-          <w:szCs w:val="20"/>
-          <w:lang w:eastAsia="es-419"/>
-        </w:rPr>
-        <w:t>member.memberDivision</w:t>
-      </w:r>
-      <w:proofErr w:type="spellEnd"/>
-      <w:proofErr w:type="gramEnd"/>
-      <w:r>
-        <w:rPr>
-          <w:rFonts w:ascii="Courier New" w:eastAsia="Times New Roman" w:hAnsi="Courier New" w:cs="Courier New"/>
-          <w:sz w:val="20"/>
-          <w:szCs w:val="20"/>
-          <w:lang w:eastAsia="es-419"/>
-        </w:rPr>
-        <w:t xml:space="preserve"> === </w:t>
-      </w:r>
-      <w:proofErr w:type="spellStart"/>
-      <w:r>
-        <w:rPr>
-          <w:rFonts w:ascii="Courier New" w:eastAsia="Times New Roman" w:hAnsi="Courier New" w:cs="Courier New"/>
-          <w:sz w:val="20"/>
-          <w:szCs w:val="20"/>
-          <w:lang w:eastAsia="es-419"/>
-        </w:rPr>
-        <w:t>tab.value</w:t>
-      </w:r>
-      <w:proofErr w:type="spellEnd"/>
-    </w:p>
-    <w:p>
-      <w:pPr>
-        <w:numPr>
-          <w:ilvl w:val="0"/>
-          <w:numId w:val="1"/>
-        </w:numPr>
-        <w:spacing w:before="100" w:beforeAutospacing="1" w:after="100" w:afterAutospacing="1" w:line="240" w:lineRule="auto"/>
-        <w:rPr>
-          <w:rFonts w:ascii="Times New Roman" w:eastAsia="Times New Roman" w:hAnsi="Times New Roman" w:cs="Times New Roman"/>
-          <w:sz w:val="24"/>
-          <w:szCs w:val="24"/>
-          <w:lang w:val="en-US" w:eastAsia="es-419"/>
-        </w:rPr>
-      </w:pPr>
-      <w:proofErr w:type="spellStart"/>
-      <w:r>
-        <w:rPr>
-          <w:rFonts w:ascii="Courier New" w:eastAsia="Times New Roman" w:hAnsi="Courier New" w:cs="Courier New"/>
-          <w:sz w:val="20"/>
-          <w:szCs w:val="20"/>
-          <w:lang w:val="en-US" w:eastAsia="es-419"/>
-        </w:rPr>
-        <w:t>applyFilter</w:t>
-      </w:r>
-      <w:proofErr w:type="spellEnd"/>
-      <w:r>
-        <w:rPr>
-          <w:rFonts w:ascii="Times New Roman" w:eastAsia="Times New Roman" w:hAnsi="Times New Roman" w:cs="Times New Roman"/>
-          <w:sz w:val="24"/>
-          <w:szCs w:val="24"/>
-          <w:lang w:val="en-US" w:eastAsia="es-419"/>
-        </w:rPr>
-        <w:t xml:space="preserve"> (</w:t>
-      </w:r>
-      <w:proofErr w:type="spellStart"/>
-      <w:r>
-        <w:rPr>
-          <w:rFonts w:ascii="Times New Roman" w:eastAsia="Times New Roman" w:hAnsi="Times New Roman" w:cs="Times New Roman"/>
-          <w:sz w:val="24"/>
-          <w:szCs w:val="24"/>
-          <w:lang w:val="en-US" w:eastAsia="es-419"/>
-        </w:rPr>
-        <w:t>filtro</w:t>
-      </w:r>
-      <w:proofErr w:type="spellEnd"/>
-      <w:r>
-        <w:rPr>
-          <w:rFonts w:ascii="Times New Roman" w:eastAsia="Times New Roman" w:hAnsi="Times New Roman" w:cs="Times New Roman"/>
-          <w:sz w:val="24"/>
-          <w:szCs w:val="24"/>
-          <w:lang w:val="en-US" w:eastAsia="es-419"/>
-        </w:rPr>
-        <w:t xml:space="preserve"> por </w:t>
-      </w:r>
-      <w:proofErr w:type="spellStart"/>
-      <w:r>
-        <w:rPr>
-          <w:rFonts w:ascii="Times New Roman" w:eastAsia="Times New Roman" w:hAnsi="Times New Roman" w:cs="Times New Roman"/>
-          <w:sz w:val="24"/>
-          <w:szCs w:val="24"/>
-          <w:lang w:val="en-US" w:eastAsia="es-419"/>
-        </w:rPr>
-        <w:t>división</w:t>
-      </w:r>
-      <w:proofErr w:type="spellEnd"/>
-      <w:r>
-        <w:rPr>
-          <w:rFonts w:ascii="Times New Roman" w:eastAsia="Times New Roman" w:hAnsi="Times New Roman" w:cs="Times New Roman"/>
-          <w:sz w:val="24"/>
-          <w:szCs w:val="24"/>
-          <w:lang w:val="en-US" w:eastAsia="es-419"/>
-        </w:rPr>
-        <w:t>):</w:t>
-      </w:r>
-      <w:r>
-        <w:rPr>
-          <w:rFonts w:ascii="Times New Roman" w:eastAsia="Times New Roman" w:hAnsi="Times New Roman" w:cs="Times New Roman"/>
-          <w:sz w:val="24"/>
-          <w:szCs w:val="24"/>
-          <w:lang w:val="en-US" w:eastAsia="es-419"/>
-        </w:rPr>
-        <w:br/>
-      </w:r>
-      <w:proofErr w:type="spellStart"/>
-      <w:proofErr w:type="gramStart"/>
-      <w:r>
-        <w:rPr>
-          <w:rFonts w:ascii="Courier New" w:eastAsia="Times New Roman" w:hAnsi="Courier New" w:cs="Courier New"/>
-          <w:sz w:val="20"/>
-          <w:szCs w:val="20"/>
-          <w:lang w:val="en-US" w:eastAsia="es-419"/>
-        </w:rPr>
-        <w:t>member.memberDivision</w:t>
-      </w:r>
-      <w:proofErr w:type="spellEnd"/>
-      <w:proofErr w:type="gramEnd"/>
-      <w:r>
-        <w:rPr>
-          <w:rFonts w:ascii="Courier New" w:eastAsia="Times New Roman" w:hAnsi="Courier New" w:cs="Courier New"/>
-          <w:sz w:val="20"/>
-          <w:szCs w:val="20"/>
-          <w:lang w:val="en-US" w:eastAsia="es-419"/>
-        </w:rPr>
-        <w:t xml:space="preserve"> === </w:t>
-      </w:r>
-      <w:proofErr w:type="spellStart"/>
-      <w:r>
-        <w:rPr>
-          <w:rFonts w:ascii="Courier New" w:eastAsia="Times New Roman" w:hAnsi="Courier New" w:cs="Courier New"/>
-          <w:sz w:val="20"/>
-          <w:szCs w:val="20"/>
+          <w:highlight w:val="yellow"/>
           <w:lang w:val="en-US" w:eastAsia="es-419"/>
         </w:rPr>
         <w:t>memberStatus</w:t>
@@ -419,6 +379,7 @@
           <w:rFonts w:ascii="Courier New" w:eastAsia="Times New Roman" w:hAnsi="Courier New" w:cs="Courier New"/>
           <w:sz w:val="20"/>
           <w:szCs w:val="20"/>
+          <w:highlight w:val="yellow"/>
           <w:lang w:eastAsia="es-419"/>
         </w:rPr>
         <w:t>row.memberDivision</w:t>
@@ -2805,7 +2766,7 @@
           <w:color w:val="A9B1D6"/>
           <w:sz w:val="21"/>
           <w:szCs w:val="21"/>
-          <w:lang w:val="en-US" w:eastAsia="es-419"/>
+          <w:lang w:eastAsia="es-419"/>
         </w:rPr>
       </w:pPr>
       <w:r>
@@ -2824,7 +2785,7 @@
           <w:color w:val="7DCFFF"/>
           <w:sz w:val="21"/>
           <w:szCs w:val="21"/>
-          <w:lang w:val="en-US" w:eastAsia="es-419"/>
+          <w:lang w:eastAsia="es-419"/>
         </w:rPr>
         <w:t>{</w:t>
       </w:r>
@@ -2834,7 +2795,7 @@
           <w:color w:val="9ABDF5"/>
           <w:sz w:val="21"/>
           <w:szCs w:val="21"/>
-          <w:lang w:val="en-US" w:eastAsia="es-419"/>
+          <w:lang w:eastAsia="es-419"/>
         </w:rPr>
         <w:t>[</w:t>
       </w:r>
@@ -2844,239 +2805,233 @@
           <w:color w:val="89DDFF"/>
           <w:sz w:val="21"/>
           <w:szCs w:val="21"/>
-          <w:lang w:val="en-US" w:eastAsia="es-419"/>
+          <w:lang w:eastAsia="es-419"/>
         </w:rPr>
         <w:t>'</w:t>
       </w:r>
+      <w:r>
+        <w:rPr>
+          <w:rFonts w:ascii="Consolas" w:eastAsia="Times New Roman" w:hAnsi="Consolas" w:cs="Times New Roman"/>
+          <w:color w:val="9ECE6A"/>
+          <w:sz w:val="21"/>
+          <w:szCs w:val="21"/>
+          <w:lang w:eastAsia="es-419"/>
+        </w:rPr>
+        <w:t>Exploradores</w:t>
+      </w:r>
+      <w:r>
+        <w:rPr>
+          <w:rFonts w:ascii="Consolas" w:eastAsia="Times New Roman" w:hAnsi="Consolas" w:cs="Times New Roman"/>
+          <w:color w:val="89DDFF"/>
+          <w:sz w:val="21"/>
+          <w:szCs w:val="21"/>
+          <w:lang w:eastAsia="es-419"/>
+        </w:rPr>
+        <w:t>',</w:t>
+      </w:r>
+      <w:r>
+        <w:rPr>
+          <w:rFonts w:ascii="Consolas" w:eastAsia="Times New Roman" w:hAnsi="Consolas" w:cs="Times New Roman"/>
+          <w:color w:val="9AA5CE"/>
+          <w:sz w:val="21"/>
+          <w:szCs w:val="21"/>
+          <w:lang w:eastAsia="es-419"/>
+        </w:rPr>
+        <w:t xml:space="preserve"> </w:t>
+      </w:r>
+      <w:r>
+        <w:rPr>
+          <w:rFonts w:ascii="Consolas" w:eastAsia="Times New Roman" w:hAnsi="Consolas" w:cs="Times New Roman"/>
+          <w:color w:val="89DDFF"/>
+          <w:sz w:val="21"/>
+          <w:szCs w:val="21"/>
+          <w:lang w:eastAsia="es-419"/>
+        </w:rPr>
+        <w:t>'</w:t>
+      </w:r>
+      <w:r>
+        <w:rPr>
+          <w:rFonts w:ascii="Consolas" w:eastAsia="Times New Roman" w:hAnsi="Consolas" w:cs="Times New Roman"/>
+          <w:color w:val="9ECE6A"/>
+          <w:sz w:val="21"/>
+          <w:szCs w:val="21"/>
+          <w:lang w:eastAsia="es-419"/>
+        </w:rPr>
+        <w:t>Seguidores</w:t>
+      </w:r>
+      <w:r>
+        <w:rPr>
+          <w:rFonts w:ascii="Consolas" w:eastAsia="Times New Roman" w:hAnsi="Consolas" w:cs="Times New Roman"/>
+          <w:color w:val="89DDFF"/>
+          <w:sz w:val="21"/>
+          <w:szCs w:val="21"/>
+          <w:lang w:eastAsia="es-419"/>
+        </w:rPr>
+        <w:t>',</w:t>
+      </w:r>
+      <w:r>
+        <w:rPr>
+          <w:rFonts w:ascii="Consolas" w:eastAsia="Times New Roman" w:hAnsi="Consolas" w:cs="Times New Roman"/>
+          <w:color w:val="9AA5CE"/>
+          <w:sz w:val="21"/>
+          <w:szCs w:val="21"/>
+          <w:lang w:eastAsia="es-419"/>
+        </w:rPr>
+        <w:t xml:space="preserve"> </w:t>
+      </w:r>
+      <w:r>
+        <w:rPr>
+          <w:rFonts w:ascii="Consolas" w:eastAsia="Times New Roman" w:hAnsi="Consolas" w:cs="Times New Roman"/>
+          <w:color w:val="89DDFF"/>
+          <w:sz w:val="21"/>
+          <w:szCs w:val="21"/>
+          <w:lang w:eastAsia="es-419"/>
+        </w:rPr>
+        <w:t>'</w:t>
+      </w:r>
+      <w:r>
+        <w:rPr>
+          <w:rFonts w:ascii="Consolas" w:eastAsia="Times New Roman" w:hAnsi="Consolas" w:cs="Times New Roman"/>
+          <w:color w:val="9ECE6A"/>
+          <w:sz w:val="21"/>
+          <w:szCs w:val="21"/>
+          <w:lang w:eastAsia="es-419"/>
+        </w:rPr>
+        <w:t>Pioneros</w:t>
+      </w:r>
+      <w:r>
+        <w:rPr>
+          <w:rFonts w:ascii="Consolas" w:eastAsia="Times New Roman" w:hAnsi="Consolas" w:cs="Times New Roman"/>
+          <w:color w:val="89DDFF"/>
+          <w:sz w:val="21"/>
+          <w:szCs w:val="21"/>
+          <w:lang w:eastAsia="es-419"/>
+        </w:rPr>
+        <w:t>',</w:t>
+      </w:r>
+      <w:r>
+        <w:rPr>
+          <w:rFonts w:ascii="Consolas" w:eastAsia="Times New Roman" w:hAnsi="Consolas" w:cs="Times New Roman"/>
+          <w:color w:val="9AA5CE"/>
+          <w:sz w:val="21"/>
+          <w:szCs w:val="21"/>
+          <w:lang w:eastAsia="es-419"/>
+        </w:rPr>
+        <w:t xml:space="preserve"> </w:t>
+      </w:r>
+      <w:r>
+        <w:rPr>
+          <w:rFonts w:ascii="Consolas" w:eastAsia="Times New Roman" w:hAnsi="Consolas" w:cs="Times New Roman"/>
+          <w:color w:val="89DDFF"/>
+          <w:sz w:val="21"/>
+          <w:szCs w:val="21"/>
+          <w:lang w:eastAsia="es-419"/>
+        </w:rPr>
+        <w:t>'</w:t>
+      </w:r>
+      <w:r>
+        <w:rPr>
+          <w:rFonts w:ascii="Consolas" w:eastAsia="Times New Roman" w:hAnsi="Consolas" w:cs="Times New Roman"/>
+          <w:color w:val="9ECE6A"/>
+          <w:sz w:val="21"/>
+          <w:szCs w:val="21"/>
+          <w:lang w:eastAsia="es-419"/>
+        </w:rPr>
+        <w:t>Navegantes</w:t>
+      </w:r>
+      <w:r>
+        <w:rPr>
+          <w:rFonts w:ascii="Consolas" w:eastAsia="Times New Roman" w:hAnsi="Consolas" w:cs="Times New Roman"/>
+          <w:color w:val="89DDFF"/>
+          <w:sz w:val="21"/>
+          <w:szCs w:val="21"/>
+          <w:lang w:eastAsia="es-419"/>
+        </w:rPr>
+        <w:t>'</w:t>
+      </w:r>
+      <w:proofErr w:type="gramStart"/>
+      <w:r>
+        <w:rPr>
+          <w:rFonts w:ascii="Consolas" w:eastAsia="Times New Roman" w:hAnsi="Consolas" w:cs="Times New Roman"/>
+          <w:color w:val="9ABDF5"/>
+          <w:sz w:val="21"/>
+          <w:szCs w:val="21"/>
+          <w:lang w:eastAsia="es-419"/>
+        </w:rPr>
+        <w:t>]</w:t>
+      </w:r>
+      <w:r>
+        <w:rPr>
+          <w:rFonts w:ascii="Consolas" w:eastAsia="Times New Roman" w:hAnsi="Consolas" w:cs="Times New Roman"/>
+          <w:color w:val="89DDFF"/>
+          <w:sz w:val="21"/>
+          <w:szCs w:val="21"/>
+          <w:lang w:eastAsia="es-419"/>
+        </w:rPr>
+        <w:t>.</w:t>
+      </w:r>
       <w:proofErr w:type="spellStart"/>
       <w:r>
         <w:rPr>
           <w:rFonts w:ascii="Consolas" w:eastAsia="Times New Roman" w:hAnsi="Consolas" w:cs="Times New Roman"/>
-          <w:color w:val="9ECE6A"/>
-          <w:sz w:val="21"/>
-          <w:szCs w:val="21"/>
-          <w:lang w:val="en-US" w:eastAsia="es-419"/>
-        </w:rPr>
-        <w:t>Exploradores</w:t>
+          <w:color w:val="7AA2F7"/>
+          <w:sz w:val="21"/>
+          <w:szCs w:val="21"/>
+          <w:lang w:eastAsia="es-419"/>
+        </w:rPr>
+        <w:t>includes</w:t>
       </w:r>
       <w:proofErr w:type="spellEnd"/>
-      <w:r>
-        <w:rPr>
-          <w:rFonts w:ascii="Consolas" w:eastAsia="Times New Roman" w:hAnsi="Consolas" w:cs="Times New Roman"/>
-          <w:color w:val="89DDFF"/>
-          <w:sz w:val="21"/>
-          <w:szCs w:val="21"/>
-          <w:lang w:val="en-US" w:eastAsia="es-419"/>
-        </w:rPr>
-        <w:t>',</w:t>
-      </w:r>
-      <w:r>
-        <w:rPr>
-          <w:rFonts w:ascii="Consolas" w:eastAsia="Times New Roman" w:hAnsi="Consolas" w:cs="Times New Roman"/>
-          <w:color w:val="9AA5CE"/>
-          <w:sz w:val="21"/>
-          <w:szCs w:val="21"/>
-          <w:lang w:val="en-US" w:eastAsia="es-419"/>
-        </w:rPr>
-        <w:t xml:space="preserve"> </w:t>
-      </w:r>
-      <w:r>
-        <w:rPr>
-          <w:rFonts w:ascii="Consolas" w:eastAsia="Times New Roman" w:hAnsi="Consolas" w:cs="Times New Roman"/>
-          <w:color w:val="89DDFF"/>
-          <w:sz w:val="21"/>
-          <w:szCs w:val="21"/>
-          <w:lang w:val="en-US" w:eastAsia="es-419"/>
-        </w:rPr>
-        <w:t>'</w:t>
+      <w:proofErr w:type="gramEnd"/>
+      <w:r>
+        <w:rPr>
+          <w:rFonts w:ascii="Consolas" w:eastAsia="Times New Roman" w:hAnsi="Consolas" w:cs="Times New Roman"/>
+          <w:color w:val="9ABDF5"/>
+          <w:sz w:val="21"/>
+          <w:szCs w:val="21"/>
+          <w:lang w:eastAsia="es-419"/>
+        </w:rPr>
+        <w:t>(</w:t>
       </w:r>
       <w:proofErr w:type="spellStart"/>
       <w:r>
         <w:rPr>
           <w:rFonts w:ascii="Consolas" w:eastAsia="Times New Roman" w:hAnsi="Consolas" w:cs="Times New Roman"/>
-          <w:color w:val="9ECE6A"/>
-          <w:sz w:val="21"/>
-          <w:szCs w:val="21"/>
-          <w:lang w:val="en-US" w:eastAsia="es-419"/>
-        </w:rPr>
-        <w:t>Seguidores</w:t>
+          <w:color w:val="C0CAF5"/>
+          <w:sz w:val="21"/>
+          <w:szCs w:val="21"/>
+          <w:lang w:eastAsia="es-419"/>
+        </w:rPr>
+        <w:t>tab</w:t>
+      </w:r>
+      <w:r>
+        <w:rPr>
+          <w:rFonts w:ascii="Consolas" w:eastAsia="Times New Roman" w:hAnsi="Consolas" w:cs="Times New Roman"/>
+          <w:color w:val="89DDFF"/>
+          <w:sz w:val="21"/>
+          <w:szCs w:val="21"/>
+          <w:lang w:eastAsia="es-419"/>
+        </w:rPr>
+        <w:t>.</w:t>
+      </w:r>
+      <w:r>
+        <w:rPr>
+          <w:rFonts w:ascii="Consolas" w:eastAsia="Times New Roman" w:hAnsi="Consolas" w:cs="Times New Roman"/>
+          <w:color w:val="7DCFFF"/>
+          <w:sz w:val="21"/>
+          <w:szCs w:val="21"/>
+          <w:lang w:eastAsia="es-419"/>
+        </w:rPr>
+        <w:t>value</w:t>
       </w:r>
       <w:proofErr w:type="spellEnd"/>
       <w:r>
         <w:rPr>
           <w:rFonts w:ascii="Consolas" w:eastAsia="Times New Roman" w:hAnsi="Consolas" w:cs="Times New Roman"/>
-          <w:color w:val="89DDFF"/>
-          <w:sz w:val="21"/>
-          <w:szCs w:val="21"/>
-          <w:lang w:val="en-US" w:eastAsia="es-419"/>
-        </w:rPr>
-        <w:t>',</w:t>
-      </w:r>
-      <w:r>
-        <w:rPr>
-          <w:rFonts w:ascii="Consolas" w:eastAsia="Times New Roman" w:hAnsi="Consolas" w:cs="Times New Roman"/>
-          <w:color w:val="9AA5CE"/>
-          <w:sz w:val="21"/>
-          <w:szCs w:val="21"/>
-          <w:lang w:val="en-US" w:eastAsia="es-419"/>
-        </w:rPr>
-        <w:t xml:space="preserve"> </w:t>
-      </w:r>
-      <w:r>
-        <w:rPr>
-          <w:rFonts w:ascii="Consolas" w:eastAsia="Times New Roman" w:hAnsi="Consolas" w:cs="Times New Roman"/>
-          <w:color w:val="89DDFF"/>
-          <w:sz w:val="21"/>
-          <w:szCs w:val="21"/>
-          <w:lang w:val="en-US" w:eastAsia="es-419"/>
-        </w:rPr>
-        <w:t>'</w:t>
-      </w:r>
-      <w:proofErr w:type="spellStart"/>
-      <w:r>
-        <w:rPr>
-          <w:rFonts w:ascii="Consolas" w:eastAsia="Times New Roman" w:hAnsi="Consolas" w:cs="Times New Roman"/>
-          <w:color w:val="9ECE6A"/>
-          <w:sz w:val="21"/>
-          <w:szCs w:val="21"/>
-          <w:lang w:val="en-US" w:eastAsia="es-419"/>
-        </w:rPr>
-        <w:t>Pioneros</w:t>
-      </w:r>
-      <w:proofErr w:type="spellEnd"/>
-      <w:r>
-        <w:rPr>
-          <w:rFonts w:ascii="Consolas" w:eastAsia="Times New Roman" w:hAnsi="Consolas" w:cs="Times New Roman"/>
-          <w:color w:val="89DDFF"/>
-          <w:sz w:val="21"/>
-          <w:szCs w:val="21"/>
-          <w:lang w:val="en-US" w:eastAsia="es-419"/>
-        </w:rPr>
-        <w:t>',</w:t>
-      </w:r>
-      <w:r>
-        <w:rPr>
-          <w:rFonts w:ascii="Consolas" w:eastAsia="Times New Roman" w:hAnsi="Consolas" w:cs="Times New Roman"/>
-          <w:color w:val="9AA5CE"/>
-          <w:sz w:val="21"/>
-          <w:szCs w:val="21"/>
-          <w:lang w:val="en-US" w:eastAsia="es-419"/>
-        </w:rPr>
-        <w:t xml:space="preserve"> </w:t>
-      </w:r>
-      <w:r>
-        <w:rPr>
-          <w:rFonts w:ascii="Consolas" w:eastAsia="Times New Roman" w:hAnsi="Consolas" w:cs="Times New Roman"/>
-          <w:color w:val="89DDFF"/>
-          <w:sz w:val="21"/>
-          <w:szCs w:val="21"/>
-          <w:lang w:val="en-US" w:eastAsia="es-419"/>
-        </w:rPr>
-        <w:t>'</w:t>
-      </w:r>
-      <w:proofErr w:type="spellStart"/>
-      <w:r>
-        <w:rPr>
-          <w:rFonts w:ascii="Consolas" w:eastAsia="Times New Roman" w:hAnsi="Consolas" w:cs="Times New Roman"/>
-          <w:color w:val="9ECE6A"/>
-          <w:sz w:val="21"/>
-          <w:szCs w:val="21"/>
-          <w:lang w:val="en-US" w:eastAsia="es-419"/>
-        </w:rPr>
-        <w:t>Navegantes</w:t>
-      </w:r>
-      <w:proofErr w:type="spellEnd"/>
-      <w:r>
-        <w:rPr>
-          <w:rFonts w:ascii="Consolas" w:eastAsia="Times New Roman" w:hAnsi="Consolas" w:cs="Times New Roman"/>
-          <w:color w:val="89DDFF"/>
-          <w:sz w:val="21"/>
-          <w:szCs w:val="21"/>
-          <w:lang w:val="en-US" w:eastAsia="es-419"/>
-        </w:rPr>
-        <w:t>'</w:t>
-      </w:r>
-      <w:proofErr w:type="gramStart"/>
-      <w:r>
-        <w:rPr>
-          <w:rFonts w:ascii="Consolas" w:eastAsia="Times New Roman" w:hAnsi="Consolas" w:cs="Times New Roman"/>
           <w:color w:val="9ABDF5"/>
           <w:sz w:val="21"/>
           <w:szCs w:val="21"/>
-          <w:lang w:val="en-US" w:eastAsia="es-419"/>
-        </w:rPr>
-        <w:t>]</w:t>
-      </w:r>
-      <w:r>
-        <w:rPr>
-          <w:rFonts w:ascii="Consolas" w:eastAsia="Times New Roman" w:hAnsi="Consolas" w:cs="Times New Roman"/>
-          <w:color w:val="89DDFF"/>
-          <w:sz w:val="21"/>
-          <w:szCs w:val="21"/>
-          <w:lang w:val="en-US" w:eastAsia="es-419"/>
-        </w:rPr>
-        <w:t>.</w:t>
-      </w:r>
-      <w:r>
-        <w:rPr>
-          <w:rFonts w:ascii="Consolas" w:eastAsia="Times New Roman" w:hAnsi="Consolas" w:cs="Times New Roman"/>
-          <w:color w:val="7AA2F7"/>
-          <w:sz w:val="21"/>
-          <w:szCs w:val="21"/>
-          <w:lang w:val="en-US" w:eastAsia="es-419"/>
-        </w:rPr>
-        <w:t>includes</w:t>
-      </w:r>
-      <w:proofErr w:type="gramEnd"/>
-      <w:r>
-        <w:rPr>
-          <w:rFonts w:ascii="Consolas" w:eastAsia="Times New Roman" w:hAnsi="Consolas" w:cs="Times New Roman"/>
-          <w:color w:val="9ABDF5"/>
-          <w:sz w:val="21"/>
-          <w:szCs w:val="21"/>
-          <w:lang w:val="en-US" w:eastAsia="es-419"/>
-        </w:rPr>
-        <w:t>(</w:t>
-      </w:r>
-      <w:proofErr w:type="spellStart"/>
-      <w:r>
-        <w:rPr>
-          <w:rFonts w:ascii="Consolas" w:eastAsia="Times New Roman" w:hAnsi="Consolas" w:cs="Times New Roman"/>
-          <w:color w:val="C0CAF5"/>
-          <w:sz w:val="21"/>
-          <w:szCs w:val="21"/>
-          <w:lang w:val="en-US" w:eastAsia="es-419"/>
-        </w:rPr>
-        <w:t>tab</w:t>
-      </w:r>
-      <w:r>
-        <w:rPr>
-          <w:rFonts w:ascii="Consolas" w:eastAsia="Times New Roman" w:hAnsi="Consolas" w:cs="Times New Roman"/>
-          <w:color w:val="89DDFF"/>
-          <w:sz w:val="21"/>
-          <w:szCs w:val="21"/>
-          <w:lang w:val="en-US" w:eastAsia="es-419"/>
-        </w:rPr>
-        <w:t>.</w:t>
-      </w:r>
-      <w:r>
-        <w:rPr>
-          <w:rFonts w:ascii="Consolas" w:eastAsia="Times New Roman" w:hAnsi="Consolas" w:cs="Times New Roman"/>
-          <w:color w:val="7DCFFF"/>
-          <w:sz w:val="21"/>
-          <w:szCs w:val="21"/>
-          <w:lang w:val="en-US" w:eastAsia="es-419"/>
-        </w:rPr>
-        <w:t>value</w:t>
-      </w:r>
-      <w:proofErr w:type="spellEnd"/>
-      <w:r>
-        <w:rPr>
-          <w:rFonts w:ascii="Consolas" w:eastAsia="Times New Roman" w:hAnsi="Consolas" w:cs="Times New Roman"/>
-          <w:color w:val="9ABDF5"/>
-          <w:sz w:val="21"/>
-          <w:szCs w:val="21"/>
-          <w:lang w:val="en-US" w:eastAsia="es-419"/>
+          <w:lang w:eastAsia="es-419"/>
         </w:rPr>
         <w:t>)</w:t>
       </w:r>
@@ -3099,7 +3054,7 @@
           <w:color w:val="9AA5CE"/>
           <w:sz w:val="21"/>
           <w:szCs w:val="21"/>
-          <w:lang w:val="en-US" w:eastAsia="es-419"/>
+          <w:lang w:eastAsia="es-419"/>
         </w:rPr>
         <w:t xml:space="preserve">                      </w:t>
       </w:r>
@@ -3351,7 +3306,7 @@
           <w:color w:val="A9B1D6"/>
           <w:sz w:val="21"/>
           <w:szCs w:val="21"/>
-          <w:lang w:eastAsia="es-419"/>
+          <w:lang w:val="en-US" w:eastAsia="es-419"/>
         </w:rPr>
       </w:pPr>
       <w:r>
@@ -3370,7 +3325,7 @@
           <w:color w:val="BB9AF7"/>
           <w:sz w:val="21"/>
           <w:szCs w:val="21"/>
-          <w:lang w:eastAsia="es-419"/>
+          <w:lang w:val="en-US" w:eastAsia="es-419"/>
         </w:rPr>
         <w:t>:</w:t>
       </w:r>
@@ -3380,7 +3335,7 @@
           <w:color w:val="9AA5CE"/>
           <w:sz w:val="21"/>
           <w:szCs w:val="21"/>
-          <w:lang w:eastAsia="es-419"/>
+          <w:lang w:val="en-US" w:eastAsia="es-419"/>
         </w:rPr>
         <w:t xml:space="preserve"> </w:t>
       </w:r>
@@ -3391,7 +3346,7 @@
           <w:color w:val="C0CAF5"/>
           <w:sz w:val="21"/>
           <w:szCs w:val="21"/>
-          <w:lang w:eastAsia="es-419"/>
+          <w:lang w:val="en-US" w:eastAsia="es-419"/>
         </w:rPr>
         <w:t>tableData</w:t>
       </w:r>
@@ -3401,7 +3356,7 @@
           <w:color w:val="89DDFF"/>
           <w:sz w:val="21"/>
           <w:szCs w:val="21"/>
-          <w:lang w:eastAsia="es-419"/>
+          <w:lang w:val="en-US" w:eastAsia="es-419"/>
         </w:rPr>
         <w:t>.</w:t>
       </w:r>
@@ -3411,7 +3366,7 @@
           <w:color w:val="7DCFFF"/>
           <w:sz w:val="21"/>
           <w:szCs w:val="21"/>
-          <w:lang w:eastAsia="es-419"/>
+          <w:lang w:val="en-US" w:eastAsia="es-419"/>
         </w:rPr>
         <w:t>length</w:t>
       </w:r>
@@ -3422,7 +3377,7 @@
           <w:color w:val="7DCFFF"/>
           <w:sz w:val="21"/>
           <w:szCs w:val="21"/>
-          <w:lang w:eastAsia="es-419"/>
+          <w:lang w:val="en-US" w:eastAsia="es-419"/>
         </w:rPr>
         <w:t>}</w:t>
       </w:r>
@@ -3436,7 +3391,7 @@
           <w:color w:val="A9B1D6"/>
           <w:sz w:val="21"/>
           <w:szCs w:val="21"/>
-          <w:lang w:eastAsia="es-419"/>
+          <w:lang w:val="en-US" w:eastAsia="es-419"/>
         </w:rPr>
       </w:pPr>
       <w:r>
@@ -3445,7 +3400,7 @@
           <w:color w:val="9AA5CE"/>
           <w:sz w:val="21"/>
           <w:szCs w:val="21"/>
-          <w:lang w:eastAsia="es-419"/>
+          <w:lang w:val="en-US" w:eastAsia="es-419"/>
         </w:rPr>
         <w:t xml:space="preserve">                  </w:t>
       </w:r>
@@ -3455,29 +3410,27 @@
           <w:color w:val="BA3C97"/>
           <w:sz w:val="21"/>
           <w:szCs w:val="21"/>
-          <w:lang w:eastAsia="es-419"/>
+          <w:lang w:val="en-US" w:eastAsia="es-419"/>
         </w:rPr>
         <w:t>&lt;/</w:t>
       </w:r>
-      <w:proofErr w:type="spellStart"/>
       <w:r>
         <w:rPr>
           <w:rFonts w:ascii="Consolas" w:eastAsia="Times New Roman" w:hAnsi="Consolas" w:cs="Times New Roman"/>
           <w:color w:val="DE5971"/>
           <w:sz w:val="21"/>
           <w:szCs w:val="21"/>
-          <w:lang w:eastAsia="es-419"/>
+          <w:lang w:val="en-US" w:eastAsia="es-419"/>
         </w:rPr>
         <w:t>Label</w:t>
       </w:r>
-      <w:proofErr w:type="spellEnd"/>
       <w:r>
         <w:rPr>
           <w:rFonts w:ascii="Consolas" w:eastAsia="Times New Roman" w:hAnsi="Consolas" w:cs="Times New Roman"/>
           <w:color w:val="BA3C97"/>
           <w:sz w:val="21"/>
           <w:szCs w:val="21"/>
-          <w:lang w:eastAsia="es-419"/>
+          <w:lang w:val="en-US" w:eastAsia="es-419"/>
         </w:rPr>
         <w:t>&gt;</w:t>
       </w:r>
@@ -5333,6 +5286,388 @@
         </w:rPr>
         <w:t>;</w:t>
       </w:r>
+    </w:p>
+    <w:p>
+      <w:pPr>
+        <w:rPr>
+          <w:lang w:val="en-US"/>
+        </w:rPr>
+      </w:pPr>
+    </w:p>
+    <w:p>
+      <w:pPr>
+        <w:rPr>
+          <w:lang w:val="en-US"/>
+        </w:rPr>
+      </w:pPr>
+      <w:proofErr w:type="spellStart"/>
+      <w:r>
+        <w:rPr>
+          <w:lang w:val="en-US"/>
+        </w:rPr>
+        <w:t>Luego</w:t>
+      </w:r>
+      <w:proofErr w:type="spellEnd"/>
+      <w:r>
+        <w:rPr>
+          <w:lang w:val="en-US"/>
+        </w:rPr>
+        <w:t xml:space="preserve"> se </w:t>
+      </w:r>
+      <w:proofErr w:type="spellStart"/>
+      <w:r>
+        <w:rPr>
+          <w:lang w:val="en-US"/>
+        </w:rPr>
+        <w:t>exporta</w:t>
+      </w:r>
+      <w:proofErr w:type="spellEnd"/>
+      <w:r>
+        <w:rPr>
+          <w:lang w:val="en-US"/>
+        </w:rPr>
+        <w:t xml:space="preserve"> </w:t>
+      </w:r>
+      <w:proofErr w:type="spellStart"/>
+      <w:r>
+        <w:rPr>
+          <w:lang w:val="en-US"/>
+        </w:rPr>
+        <w:t>en</w:t>
+      </w:r>
+      <w:proofErr w:type="spellEnd"/>
+      <w:r>
+        <w:rPr>
+          <w:lang w:val="en-US"/>
+        </w:rPr>
+        <w:t xml:space="preserve"> list</w:t>
+      </w:r>
+    </w:p>
+    <w:p>
+      <w:pPr>
+        <w:rPr>
+          <w:lang w:val="en-US"/>
+        </w:rPr>
+      </w:pPr>
+    </w:p>
+    <w:p>
+      <w:pPr>
+        <w:shd w:val="clear" w:color="auto" w:fill="24283B"/>
+        <w:spacing w:after="0" w:line="285" w:lineRule="atLeast"/>
+        <w:rPr>
+          <w:rFonts w:ascii="Consolas" w:eastAsia="Times New Roman" w:hAnsi="Consolas" w:cs="Times New Roman"/>
+          <w:color w:val="A9B1D6"/>
+          <w:sz w:val="21"/>
+          <w:szCs w:val="21"/>
+          <w:lang w:val="en-US" w:eastAsia="es-419"/>
+        </w:rPr>
+      </w:pPr>
+      <w:r>
+        <w:rPr>
+          <w:rFonts w:ascii="Consolas" w:eastAsia="Times New Roman" w:hAnsi="Consolas" w:cs="Times New Roman"/>
+          <w:color w:val="7DCFFF"/>
+          <w:sz w:val="21"/>
+          <w:szCs w:val="21"/>
+          <w:lang w:val="en-US" w:eastAsia="es-419"/>
+        </w:rPr>
+        <w:t>import</w:t>
+      </w:r>
+      <w:r>
+        <w:rPr>
+          <w:rFonts w:ascii="Consolas" w:eastAsia="Times New Roman" w:hAnsi="Consolas" w:cs="Times New Roman"/>
+          <w:color w:val="A9B1D6"/>
+          <w:sz w:val="21"/>
+          <w:szCs w:val="21"/>
+          <w:lang w:val="en-US" w:eastAsia="es-419"/>
+        </w:rPr>
+        <w:t xml:space="preserve"> </w:t>
+      </w:r>
+      <w:proofErr w:type="gramStart"/>
+      <w:r>
+        <w:rPr>
+          <w:rFonts w:ascii="Consolas" w:eastAsia="Times New Roman" w:hAnsi="Consolas" w:cs="Times New Roman"/>
+          <w:color w:val="9ABDF5"/>
+          <w:sz w:val="21"/>
+          <w:szCs w:val="21"/>
+          <w:lang w:val="en-US" w:eastAsia="es-419"/>
+        </w:rPr>
+        <w:t xml:space="preserve">{ </w:t>
+      </w:r>
+      <w:r>
+        <w:rPr>
+          <w:rFonts w:ascii="Consolas" w:eastAsia="Times New Roman" w:hAnsi="Consolas" w:cs="Times New Roman"/>
+          <w:color w:val="2AC3DE"/>
+          <w:sz w:val="21"/>
+          <w:szCs w:val="21"/>
+          <w:lang w:val="en-US" w:eastAsia="es-419"/>
+        </w:rPr>
+        <w:t>_</w:t>
+      </w:r>
+      <w:proofErr w:type="spellStart"/>
+      <w:proofErr w:type="gramEnd"/>
+      <w:r>
+        <w:rPr>
+          <w:rFonts w:ascii="Consolas" w:eastAsia="Times New Roman" w:hAnsi="Consolas" w:cs="Times New Roman"/>
+          <w:color w:val="2AC3DE"/>
+          <w:sz w:val="21"/>
+          <w:szCs w:val="21"/>
+          <w:lang w:val="en-US" w:eastAsia="es-419"/>
+        </w:rPr>
+        <w:t>memberPositionsFilter</w:t>
+      </w:r>
+      <w:proofErr w:type="spellEnd"/>
+      <w:r>
+        <w:rPr>
+          <w:rFonts w:ascii="Consolas" w:eastAsia="Times New Roman" w:hAnsi="Consolas" w:cs="Times New Roman"/>
+          <w:color w:val="89DDFF"/>
+          <w:sz w:val="21"/>
+          <w:szCs w:val="21"/>
+          <w:lang w:val="en-US" w:eastAsia="es-419"/>
+        </w:rPr>
+        <w:t>,</w:t>
+      </w:r>
+      <w:r>
+        <w:rPr>
+          <w:rFonts w:ascii="Consolas" w:eastAsia="Times New Roman" w:hAnsi="Consolas" w:cs="Times New Roman"/>
+          <w:color w:val="9ABDF5"/>
+          <w:sz w:val="21"/>
+          <w:szCs w:val="21"/>
+          <w:lang w:val="en-US" w:eastAsia="es-419"/>
+        </w:rPr>
+        <w:t xml:space="preserve"> </w:t>
+      </w:r>
+      <w:r>
+        <w:rPr>
+          <w:rFonts w:ascii="Consolas" w:eastAsia="Times New Roman" w:hAnsi="Consolas" w:cs="Times New Roman"/>
+          <w:color w:val="2AC3DE"/>
+          <w:sz w:val="21"/>
+          <w:szCs w:val="21"/>
+          <w:lang w:val="en-US" w:eastAsia="es-419"/>
+        </w:rPr>
+        <w:t>_</w:t>
+      </w:r>
+      <w:proofErr w:type="spellStart"/>
+      <w:r>
+        <w:rPr>
+          <w:rFonts w:ascii="Consolas" w:eastAsia="Times New Roman" w:hAnsi="Consolas" w:cs="Times New Roman"/>
+          <w:color w:val="2AC3DE"/>
+          <w:sz w:val="21"/>
+          <w:szCs w:val="21"/>
+          <w:lang w:val="en-US" w:eastAsia="es-419"/>
+        </w:rPr>
+        <w:t>memberList</w:t>
+      </w:r>
+      <w:proofErr w:type="spellEnd"/>
+      <w:r>
+        <w:rPr>
+          <w:rFonts w:ascii="Consolas" w:eastAsia="Times New Roman" w:hAnsi="Consolas" w:cs="Times New Roman"/>
+          <w:color w:val="89DDFF"/>
+          <w:sz w:val="21"/>
+          <w:szCs w:val="21"/>
+          <w:lang w:val="en-US" w:eastAsia="es-419"/>
+        </w:rPr>
+        <w:t>,</w:t>
+      </w:r>
+      <w:r>
+        <w:rPr>
+          <w:rFonts w:ascii="Consolas" w:eastAsia="Times New Roman" w:hAnsi="Consolas" w:cs="Times New Roman"/>
+          <w:color w:val="9ABDF5"/>
+          <w:sz w:val="21"/>
+          <w:szCs w:val="21"/>
+          <w:lang w:val="en-US" w:eastAsia="es-419"/>
+        </w:rPr>
+        <w:t xml:space="preserve"> </w:t>
+      </w:r>
+      <w:r>
+        <w:rPr>
+          <w:rFonts w:ascii="Consolas" w:eastAsia="Times New Roman" w:hAnsi="Consolas" w:cs="Times New Roman"/>
+          <w:color w:val="2AC3DE"/>
+          <w:sz w:val="21"/>
+          <w:szCs w:val="21"/>
+          <w:lang w:val="en-US" w:eastAsia="es-419"/>
+        </w:rPr>
+        <w:t>MEMBER_STATUS_OPTIONS</w:t>
+      </w:r>
+      <w:r>
+        <w:rPr>
+          <w:rFonts w:ascii="Consolas" w:eastAsia="Times New Roman" w:hAnsi="Consolas" w:cs="Times New Roman"/>
+          <w:color w:val="9ABDF5"/>
+          <w:sz w:val="21"/>
+          <w:szCs w:val="21"/>
+          <w:lang w:val="en-US" w:eastAsia="es-419"/>
+        </w:rPr>
+        <w:t xml:space="preserve"> }</w:t>
+      </w:r>
+      <w:r>
+        <w:rPr>
+          <w:rFonts w:ascii="Consolas" w:eastAsia="Times New Roman" w:hAnsi="Consolas" w:cs="Times New Roman"/>
+          <w:color w:val="A9B1D6"/>
+          <w:sz w:val="21"/>
+          <w:szCs w:val="21"/>
+          <w:lang w:val="en-US" w:eastAsia="es-419"/>
+        </w:rPr>
+        <w:t xml:space="preserve"> </w:t>
+      </w:r>
+      <w:r>
+        <w:rPr>
+          <w:rFonts w:ascii="Consolas" w:eastAsia="Times New Roman" w:hAnsi="Consolas" w:cs="Times New Roman"/>
+          <w:color w:val="7DCFFF"/>
+          <w:sz w:val="21"/>
+          <w:szCs w:val="21"/>
+          <w:lang w:val="en-US" w:eastAsia="es-419"/>
+        </w:rPr>
+        <w:t>from</w:t>
+      </w:r>
+      <w:r>
+        <w:rPr>
+          <w:rFonts w:ascii="Consolas" w:eastAsia="Times New Roman" w:hAnsi="Consolas" w:cs="Times New Roman"/>
+          <w:color w:val="A9B1D6"/>
+          <w:sz w:val="21"/>
+          <w:szCs w:val="21"/>
+          <w:lang w:val="en-US" w:eastAsia="es-419"/>
+        </w:rPr>
+        <w:t xml:space="preserve"> </w:t>
+      </w:r>
+      <w:r>
+        <w:rPr>
+          <w:rFonts w:ascii="Consolas" w:eastAsia="Times New Roman" w:hAnsi="Consolas" w:cs="Times New Roman"/>
+          <w:color w:val="89DDFF"/>
+          <w:sz w:val="21"/>
+          <w:szCs w:val="21"/>
+          <w:lang w:val="en-US" w:eastAsia="es-419"/>
+        </w:rPr>
+        <w:t>'</w:t>
+      </w:r>
+      <w:proofErr w:type="spellStart"/>
+      <w:r>
+        <w:rPr>
+          <w:rFonts w:ascii="Consolas" w:eastAsia="Times New Roman" w:hAnsi="Consolas" w:cs="Times New Roman"/>
+          <w:color w:val="9ECE6A"/>
+          <w:sz w:val="21"/>
+          <w:szCs w:val="21"/>
+          <w:lang w:val="en-US" w:eastAsia="es-419"/>
+        </w:rPr>
+        <w:t>src</w:t>
+      </w:r>
+      <w:proofErr w:type="spellEnd"/>
+      <w:r>
+        <w:rPr>
+          <w:rFonts w:ascii="Consolas" w:eastAsia="Times New Roman" w:hAnsi="Consolas" w:cs="Times New Roman"/>
+          <w:color w:val="9ECE6A"/>
+          <w:sz w:val="21"/>
+          <w:szCs w:val="21"/>
+          <w:lang w:val="en-US" w:eastAsia="es-419"/>
+        </w:rPr>
+        <w:t>/_mock</w:t>
+      </w:r>
+      <w:r>
+        <w:rPr>
+          <w:rFonts w:ascii="Consolas" w:eastAsia="Times New Roman" w:hAnsi="Consolas" w:cs="Times New Roman"/>
+          <w:color w:val="89DDFF"/>
+          <w:sz w:val="21"/>
+          <w:szCs w:val="21"/>
+          <w:lang w:val="en-US" w:eastAsia="es-419"/>
+        </w:rPr>
+        <w:t>';</w:t>
+      </w:r>
+    </w:p>
+    <w:p>
+      <w:pPr>
+        <w:rPr>
+          <w:lang w:val="en-US"/>
+        </w:rPr>
+      </w:pPr>
+    </w:p>
+    <w:p>
+      <w:pPr>
+        <w:rPr>
+          <w:lang w:val="en-US"/>
+        </w:rPr>
+      </w:pPr>
+      <w:r>
+        <w:rPr>
+          <w:lang w:val="en-US"/>
+        </w:rPr>
+        <w:t xml:space="preserve">Se </w:t>
+      </w:r>
+      <w:proofErr w:type="spellStart"/>
+      <w:r>
+        <w:rPr>
+          <w:lang w:val="en-US"/>
+        </w:rPr>
+        <w:t>comenta</w:t>
+      </w:r>
+      <w:proofErr w:type="spellEnd"/>
+      <w:r>
+        <w:rPr>
+          <w:lang w:val="en-US"/>
+        </w:rPr>
+        <w:t xml:space="preserve">: </w:t>
+      </w:r>
+    </w:p>
+    <w:p>
+      <w:pPr>
+        <w:shd w:val="clear" w:color="auto" w:fill="24283B"/>
+        <w:spacing w:after="0" w:line="285" w:lineRule="atLeast"/>
+        <w:rPr>
+          <w:rFonts w:ascii="Consolas" w:eastAsia="Times New Roman" w:hAnsi="Consolas" w:cs="Times New Roman"/>
+          <w:color w:val="A9B1D6"/>
+          <w:sz w:val="21"/>
+          <w:szCs w:val="21"/>
+          <w:lang w:val="en-US" w:eastAsia="es-419"/>
+        </w:rPr>
+      </w:pPr>
+      <w:r>
+        <w:rPr>
+          <w:rFonts w:ascii="Consolas" w:eastAsia="Times New Roman" w:hAnsi="Consolas" w:cs="Times New Roman"/>
+          <w:i/>
+          <w:iCs/>
+          <w:color w:val="5F6996"/>
+          <w:sz w:val="21"/>
+          <w:szCs w:val="21"/>
+          <w:lang w:val="en-US" w:eastAsia="es-419"/>
+        </w:rPr>
+        <w:t xml:space="preserve">// const STATUS_OPTIONS = </w:t>
+      </w:r>
+      <w:proofErr w:type="gramStart"/>
+      <w:r>
+        <w:rPr>
+          <w:rFonts w:ascii="Consolas" w:eastAsia="Times New Roman" w:hAnsi="Consolas" w:cs="Times New Roman"/>
+          <w:i/>
+          <w:iCs/>
+          <w:color w:val="5F6996"/>
+          <w:sz w:val="21"/>
+          <w:szCs w:val="21"/>
+          <w:lang w:val="en-US" w:eastAsia="es-419"/>
+        </w:rPr>
+        <w:t>[{ value</w:t>
+      </w:r>
+      <w:proofErr w:type="gramEnd"/>
+      <w:r>
+        <w:rPr>
+          <w:rFonts w:ascii="Consolas" w:eastAsia="Times New Roman" w:hAnsi="Consolas" w:cs="Times New Roman"/>
+          <w:i/>
+          <w:iCs/>
+          <w:color w:val="5F6996"/>
+          <w:sz w:val="21"/>
+          <w:szCs w:val="21"/>
+          <w:lang w:val="en-US" w:eastAsia="es-419"/>
+        </w:rPr>
+        <w:t>: 'all', label: 'All' }, ...USER_STATUS_OPTIONS];</w:t>
+      </w:r>
+    </w:p>
+    <w:p>
+      <w:pPr>
+        <w:shd w:val="clear" w:color="auto" w:fill="24283B"/>
+        <w:spacing w:after="0" w:line="285" w:lineRule="atLeast"/>
+        <w:rPr>
+          <w:rFonts w:ascii="Consolas" w:eastAsia="Times New Roman" w:hAnsi="Consolas" w:cs="Times New Roman"/>
+          <w:color w:val="A9B1D6"/>
+          <w:sz w:val="21"/>
+          <w:szCs w:val="21"/>
+          <w:lang w:val="en-US" w:eastAsia="es-419"/>
+        </w:rPr>
+      </w:pPr>
     </w:p>
     <w:p>
       <w:pPr>

</xml_diff>